<commit_message>
Docs and screens follow the plan-centred design: manual (MD, PDF, Word) with a chapter on versions and revisions, deck v5 with revision slides, README, fresh screenshots; activity page shows the revision banner
Co-Authored-By: Claude Sonnet 5.5 <noreply@anthropic.com>
</commit_message>
<xml_diff>
--- a/docs/MANUAL.docx
+++ b/docs/MANUAL.docx
@@ -103,7 +103,7 @@
         <w:t>The plan is the centre.</w:t>
       </w:r>
       <w:r>
-        <w:t xml:space="preserve"> Everything in the application hangs on the activities of the Annual Action Plan: they are what units write, what directors certify and the heads of directorates approve, what the budget received is distributed over, and what is reported month by month and quarter by quarter. The budget is part of the plan (each activity carries its budget lines); the fiscal envelope is what pays for the approved plan.</w:t>
+        <w:t xml:space="preserve"> Everything in the application hangs on the activities of the Annual Action Plan: they are what units write, what directors certify and the heads of directorates approve, what is revised when it has to change, and what is reported month by month and quarter by quarter. The budget is part of the plan: each activity carries its budget lines, and what an approved activity may spend is what its approved version says. There is no separate budget to register or distribute.</w:t>
       </w:r>
     </w:p>
     <w:p>
@@ -396,7 +396,7 @@
         <w:t>plan cycle tracker</w:t>
       </w:r>
       <w:r>
-        <w:t xml:space="preserve"> (six steps: plan submission, approval, plan finalized, budget received, distribution, reporting) and which step is current;</w:t>
+        <w:t xml:space="preserve"> (four steps: plan submission, approval, plan finalized, reporting) and which step is current;</w:t>
       </w:r>
     </w:p>
     <w:p>
@@ -404,7 +404,7 @@
         <w:pStyle w:val="ListBullet"/>
       </w:pPr>
       <w:r>
-        <w:t>key figures: the fiscal envelope, the approved plan, what has been distributed, activities approved, delivery against targets;</w:t>
+        <w:t>key figures: what is planned, the approved plan in force, what has been paid (verified), activities approved, delivery against targets;</w:t>
       </w:r>
     </w:p>
     <w:p>
@@ -608,19 +608,10 @@
         <w:rPr>
           <w:b/>
         </w:rPr>
-        <w:t>Fiscal envelope.</w:t>
-      </w:r>
-      <w:r>
-        <w:t xml:space="preserve"> The amount the institution </w:t>
-      </w:r>
-      <w:r>
-        <w:rPr>
-          <w:i/>
-        </w:rPr>
-        <w:t>receives</w:t>
-      </w:r>
-      <w:r>
-        <w:t xml:space="preserve"> for the year to carry out the approved plan: the State Budget allocation for a ministry, or the allocation from the ministry for a directorate. It is registered once it is approved.</w:t>
+        <w:t>Version.</w:t>
+      </w:r>
+      <w:r>
+        <w:t xml:space="preserve"> Every approval of an activity makes a version (1, 2, ...), a copy of what was approved, kept as it was. The amounts of the latest approved version are in force: spending is reported against them.</w:t>
       </w:r>
     </w:p>
     <w:p>
@@ -631,19 +622,10 @@
         <w:rPr>
           <w:b/>
         </w:rPr>
-        <w:t>Distribution.</w:t>
-      </w:r>
-      <w:r>
-        <w:t xml:space="preserve"> Sharing the received envelope over the </w:t>
-      </w:r>
-      <w:r>
-        <w:rPr>
-          <w:i/>
-        </w:rPr>
-        <w:t>approved</w:t>
-      </w:r>
-      <w:r>
-        <w:t xml:space="preserve"> plan, line by line, to the cent, never above what a line asked for. Any surplus stays unallocated.</w:t>
+        <w:t>Revision.</w:t>
+      </w:r>
+      <w:r>
+        <w:t xml:space="preserve"> The way to change an approved activity: it needs a reason, goes back to Draft and through the whole approval chain again, and while it does the version in force stays. When it is approved it becomes the next version.</w:t>
       </w:r>
     </w:p>
     <w:p>
@@ -1034,128 +1016,6 @@
                 <w:b/>
                 <w:sz w:val="18"/>
               </w:rPr>
-              <w:t>Budget received</w:t>
-            </w:r>
-          </w:p>
-        </w:tc>
-        <w:tc>
-          <w:tcPr>
-            <w:tcW w:type="dxa" w:w="2409"/>
-            <w:shd w:val="clear" w:color="auto" w:fill="F5F8FB"/>
-          </w:tcPr>
-          <w:p>
-            <w:r/>
-            <w:r>
-              <w:rPr>
-                <w:sz w:val="18"/>
-              </w:rPr>
-              <w:t>The institution registers the envelope it receives.</w:t>
-            </w:r>
-          </w:p>
-        </w:tc>
-        <w:tc>
-          <w:tcPr>
-            <w:tcW w:type="dxa" w:w="2409"/>
-            <w:shd w:val="clear" w:color="auto" w:fill="F5F8FB"/>
-          </w:tcPr>
-          <w:p>
-            <w:r/>
-            <w:r>
-              <w:rPr>
-                <w:sz w:val="18"/>
-              </w:rPr>
-              <w:t>Minister's office / administrators</w:t>
-            </w:r>
-          </w:p>
-        </w:tc>
-      </w:tr>
-      <w:tr>
-        <w:tc>
-          <w:tcPr>
-            <w:tcW w:type="dxa" w:w="2409"/>
-          </w:tcPr>
-          <w:p>
-            <w:r/>
-            <w:r>
-              <w:rPr>
-                <w:sz w:val="18"/>
-              </w:rPr>
-              <w:t>5</w:t>
-            </w:r>
-          </w:p>
-        </w:tc>
-        <w:tc>
-          <w:tcPr>
-            <w:tcW w:type="dxa" w:w="2409"/>
-          </w:tcPr>
-          <w:p>
-            <w:r/>
-            <w:r>
-              <w:rPr>
-                <w:b/>
-                <w:sz w:val="18"/>
-              </w:rPr>
-              <w:t>Distribution</w:t>
-            </w:r>
-          </w:p>
-        </w:tc>
-        <w:tc>
-          <w:tcPr>
-            <w:tcW w:type="dxa" w:w="2409"/>
-          </w:tcPr>
-          <w:p>
-            <w:r/>
-            <w:r>
-              <w:rPr>
-                <w:sz w:val="18"/>
-              </w:rPr>
-              <w:t>The envelope is shared over the approved plan.</w:t>
-            </w:r>
-          </w:p>
-        </w:tc>
-        <w:tc>
-          <w:tcPr>
-            <w:tcW w:type="dxa" w:w="2409"/>
-          </w:tcPr>
-          <w:p>
-            <w:r/>
-            <w:r>
-              <w:rPr>
-                <w:sz w:val="18"/>
-              </w:rPr>
-              <w:t>Administrators / budget officers</w:t>
-            </w:r>
-          </w:p>
-        </w:tc>
-      </w:tr>
-      <w:tr>
-        <w:tc>
-          <w:tcPr>
-            <w:tcW w:type="dxa" w:w="2409"/>
-            <w:shd w:val="clear" w:color="auto" w:fill="F5F8FB"/>
-          </w:tcPr>
-          <w:p>
-            <w:r/>
-            <w:r>
-              <w:rPr>
-                <w:sz w:val="18"/>
-              </w:rPr>
-              <w:t>6</w:t>
-            </w:r>
-          </w:p>
-        </w:tc>
-        <w:tc>
-          <w:tcPr>
-            <w:tcW w:type="dxa" w:w="2409"/>
-            <w:shd w:val="clear" w:color="auto" w:fill="F5F8FB"/>
-          </w:tcPr>
-          <w:p>
-            <w:r/>
-            <w:r>
-              <w:rPr>
-                <w:b/>
-                <w:sz w:val="18"/>
-              </w:rPr>
               <w:t>Reporting</w:t>
             </w:r>
           </w:p>
@@ -1171,7 +1031,7 @@
               <w:rPr>
                 <w:sz w:val="18"/>
               </w:rPr>
-              <w:t>Units report spending and indicators monthly and quarterly; others verify; the quarter is compiled; reports are printed.</w:t>
+              <w:t>Units report spending and indicators monthly and quarterly; others verify; the quarter is compiled; reports are printed. A change to an approved activity is a revision (Part 9).</w:t>
             </w:r>
           </w:p>
         </w:tc>
@@ -1348,19 +1208,19 @@
         <w:rPr>
           <w:i/>
         </w:rPr>
-        <w:t>a ministry</w:t>
-      </w:r>
-      <w:r>
-        <w:t xml:space="preserve"> (the envelope is the State Budget allocation) or </w:t>
+        <w:t>a whole ministry</w:t>
+      </w:r>
+      <w:r>
+        <w:t xml:space="preserve"> (several directorates, each finalizing its own plan) or </w:t>
       </w:r>
       <w:r>
         <w:rPr>
           <w:i/>
         </w:rPr>
-        <w:t>a directorate or gabinete inside a ministry</w:t>
-      </w:r>
-      <w:r>
-        <w:t xml:space="preserve"> (the envelope is an allocation from the ministry, and you can say who the plan is sent to). This only changes the wording and the fields of the envelope form.</w:t>
+        <w:t>one directorate or gabinete</w:t>
+      </w:r>
+      <w:r>
+        <w:t xml:space="preserve"> (its plan is sent to the ministry; you can say who it is sent to). This only changes the wording.</w:t>
       </w:r>
     </w:p>
     <w:p>
@@ -1838,7 +1698,7 @@
               <w:rPr>
                 <w:sz w:val="18"/>
               </w:rPr>
-              <w:t xml:space="preserve">Sees every plan; approves the fiscal envelope; does </w:t>
+              <w:t xml:space="preserve">Sees every plan and every report; does </w:t>
             </w:r>
             <w:r>
               <w:rPr>
@@ -3070,7 +2930,7 @@
         <w:pStyle w:val="Heading2"/>
       </w:pPr>
       <w:r>
-        <w:t>5.7 Approved activities are locked</w:t>
+        <w:t>5.7 Approved activities are changed by revision</w:t>
       </w:r>
     </w:p>
     <w:p>
@@ -3078,16 +2938,16 @@
         <w:spacing w:after="120"/>
       </w:pPr>
       <w:r>
-        <w:t xml:space="preserve">An approved activity cannot be edited. To change it, the person who can approve it (or an administrator) </w:t>
+        <w:t xml:space="preserve">An approved activity cannot be edited. To change it (a cost went up, an action was added, a target changed), someone who prepares for the unit, its director, whoever gives the final approval, or an administrator starts a </w:t>
       </w:r>
       <w:r>
         <w:rPr>
           <w:b/>
         </w:rPr>
-        <w:t>reopens</w:t>
-      </w:r>
-      <w:r>
-        <w:t xml:space="preserve"> it with a written reason, until the envelope for the year has been received. After the envelope, only its distribution changes.</w:t>
+        <w:t>revision</w:t>
+      </w:r>
+      <w:r>
+        <w:t xml:space="preserve"> with a written reason (Part 9). It never disappears from the plan while the revision is pending.</w:t>
       </w:r>
     </w:p>
     <w:p>
@@ -3591,7 +3451,7 @@
         <w:t>not</w:t>
       </w:r>
       <w:r>
-        <w:t xml:space="preserve"> approve plans; the Minister sees every plan and approves the fiscal envelope. Where a unit has an </w:t>
+        <w:t xml:space="preserve"> approve plans; the Minister sees every plan and every report. Where a unit has an </w:t>
       </w:r>
       <w:r>
         <w:rPr>
@@ -3904,7 +3764,7 @@
         <w:pStyle w:val="Heading2"/>
       </w:pPr>
       <w:r>
-        <w:t>6.5 Reopen an approved activity</w:t>
+        <w:t>6.5 Revise an approved activity</w:t>
       </w:r>
     </w:p>
     <w:p>
@@ -3918,19 +3778,10 @@
         <w:rPr>
           <w:i/>
         </w:rPr>
-        <w:t>Governance Actions → Reopen</w:t>
-      </w:r>
-      <w:r>
-        <w:t xml:space="preserve">, give the reason. It returns to </w:t>
-      </w:r>
-      <w:r>
-        <w:rPr>
-          <w:i/>
-        </w:rPr>
-        <w:t>Draft</w:t>
-      </w:r>
-      <w:r>
-        <w:t>. Only the person who can approve it, or an administrator, and only until the envelope is received.</w:t>
+        <w:t>Governance Actions → Revise</w:t>
+      </w:r>
+      <w:r>
+        <w:t>, give the reason. A revision starts (Part 9): the activity becomes a draft the unit can change and goes through the whole chain again, while the approved version stays in force.</w:t>
       </w:r>
     </w:p>
     <w:p>
@@ -3945,7 +3796,7 @@
       <w:r>
         <w:drawing>
           <wp:inline xmlns:a="http://schemas.openxmlformats.org/drawingml/2006/main" xmlns:pic="http://schemas.openxmlformats.org/drawingml/2006/picture">
-            <wp:extent cx="5832000" cy="3645000"/>
+            <wp:extent cx="5832000" cy="5301450"/>
             <wp:docPr id="13" name="Picture 13"/>
             <wp:cNvGraphicFramePr>
               <a:graphicFrameLocks noChangeAspect="1"/>
@@ -3966,7 +3817,7 @@
                   <pic:spPr>
                     <a:xfrm>
                       <a:off x="0" y="0"/>
-                      <a:ext cx="5832000" cy="3645000"/>
+                      <a:ext cx="5832000" cy="5301450"/>
                     </a:xfrm>
                     <a:prstGeom prst="rect"/>
                   </pic:spPr>
@@ -4001,7 +3852,7 @@
         <w:t>Workflow History</w:t>
       </w:r>
       <w:r>
-        <w:t xml:space="preserve"> tab lists every step: creation, submission, certification, approval, returns, reopenings, with who and when, and any note or reason. It is read from the audit log, so it cannot be edited. Where a list signs in order (7.2), every </w:t>
+        <w:t xml:space="preserve"> tab lists every step: creation, submission, certification, approval, returns, revisions started, with who and when, and any note or reason. It is read from the audit log, so it cannot be edited. Where a list signs in order (7.2), every </w:t>
       </w:r>
       <w:r>
         <w:rPr>
@@ -4349,10 +4200,19 @@
         <w:rPr>
           <w:b/>
         </w:rPr>
-        <w:t>returned or reopened</w:t>
-      </w:r>
-      <w:r>
-        <w:t xml:space="preserve">, a new </w:t>
+        <w:t>returned</w:t>
+      </w:r>
+      <w:r>
+        <w:t xml:space="preserve">, or a </w:t>
+      </w:r>
+      <w:r>
+        <w:rPr>
+          <w:b/>
+        </w:rPr>
+        <w:t>revision</w:t>
+      </w:r>
+      <w:r>
+        <w:t xml:space="preserve"> is started, a new </w:t>
       </w:r>
       <w:r>
         <w:rPr>
@@ -4774,16 +4634,16 @@
         <w:t>year ends</w:t>
       </w:r>
       <w:r>
-        <w:t xml:space="preserve"> when every directorate that planned has finalized, </w:t>
+        <w:t xml:space="preserve"> when every directorate that planned has finalized. Finalizing stops </w:t>
       </w:r>
       <w:r>
         <w:rPr>
           <w:b/>
         </w:rPr>
-        <w:t>or</w:t>
-      </w:r>
-      <w:r>
-        <w:t xml:space="preserve"> when the fiscal envelope has been received (approved) or the year is closed. From the envelope on, a plan cannot be reopened; only the distribution of the envelope changes.</w:t>
+        <w:t>new activities</w:t>
+      </w:r>
+      <w:r>
+        <w:t xml:space="preserve"> only: an approved activity can still be changed by a revision.</w:t>
       </w:r>
     </w:p>
     <w:p>
@@ -4797,7 +4657,7 @@
         <w:t>Reopening</w:t>
       </w:r>
       <w:r>
-        <w:t xml:space="preserve"> a directorate's plan (before the envelope) is for its head or an administrator, with a </w:t>
+        <w:t xml:space="preserve"> a directorate's plan (to allow new activities again) is for its head or an administrator, with a </w:t>
       </w:r>
       <w:r>
         <w:rPr>
@@ -4836,22 +4696,40 @@
         <w:pStyle w:val="Heading1"/>
       </w:pPr>
       <w:r>
-        <w:t>9. The budget: envelope, distribution and allocation</w:t>
-      </w:r>
-    </w:p>
-    <w:p>
-      <w:pPr>
-        <w:pStyle w:val="Heading2"/>
-      </w:pPr>
-      <w:r>
-        <w:t>9.1 Register the envelope</w:t>
+        <w:t>9. Changing an approved activity: revisions and versions</w:t>
+      </w:r>
+    </w:p>
+    <w:p>
+      <w:pPr>
+        <w:spacing w:after="120"/>
+      </w:pPr>
+      <w:r>
+        <w:t xml:space="preserve">There is no fiscal envelope and no distribution in this application: the plan is the budget. What an approved activity may spend is what its </w:t>
+      </w:r>
+      <w:r>
+        <w:rPr>
+          <w:b/>
+        </w:rPr>
+        <w:t>approved version</w:t>
+      </w:r>
+      <w:r>
+        <w:t xml:space="preserve"> says, and a change goes through a </w:t>
+      </w:r>
+      <w:r>
+        <w:rPr>
+          <w:b/>
+        </w:rPr>
+        <w:t>revision</w:t>
+      </w:r>
+      <w:r>
+        <w:t>, so that nothing is overwritten and the record always shows what was approved, by whom, and why it changed.</w:t>
       </w:r>
     </w:p>
     <w:p>
       <w:r>
         <w:drawing>
           <wp:inline xmlns:a="http://schemas.openxmlformats.org/drawingml/2006/main" xmlns:pic="http://schemas.openxmlformats.org/drawingml/2006/picture">
-            <wp:extent cx="5832000" cy="3645000"/>
+            <wp:extent cx="5832000" cy="5301450"/>
             <wp:docPr id="17" name="Picture 17"/>
             <wp:cNvGraphicFramePr>
               <a:graphicFrameLocks noChangeAspect="1"/>
@@ -4860,7 +4738,217 @@
               <a:graphicData uri="http://schemas.openxmlformats.org/drawingml/2006/picture">
                 <pic:pic>
                   <pic:nvPicPr>
-                    <pic:cNvPr id="0" name="envelope.png"/>
+                    <pic:cNvPr id="0" name="activity-history.png"/>
+                    <pic:cNvPicPr/>
+                  </pic:nvPicPr>
+                  <pic:blipFill>
+                    <a:blip r:embed="rId22"/>
+                    <a:stretch>
+                      <a:fillRect/>
+                    </a:stretch>
+                  </pic:blipFill>
+                  <pic:spPr>
+                    <a:xfrm>
+                      <a:off x="0" y="0"/>
+                      <a:ext cx="5832000" cy="5301450"/>
+                    </a:xfrm>
+                    <a:prstGeom prst="rect"/>
+                  </pic:spPr>
+                </pic:pic>
+              </a:graphicData>
+            </a:graphic>
+          </wp:inline>
+        </w:drawing>
+      </w:r>
+    </w:p>
+    <w:p>
+      <w:r>
+        <w:rPr>
+          <w:i/>
+          <w:color w:val="7A8CA3"/>
+          <w:sz w:val="17"/>
+        </w:rPr>
+        <w:t>Versions</w:t>
+      </w:r>
+    </w:p>
+    <w:p>
+      <w:pPr>
+        <w:pStyle w:val="Heading2"/>
+      </w:pPr>
+      <w:r>
+        <w:t>9.1 Versions</w:t>
+      </w:r>
+    </w:p>
+    <w:p>
+      <w:pPr>
+        <w:spacing w:after="120"/>
+      </w:pPr>
+      <w:r>
+        <w:t xml:space="preserve">Every approval makes a </w:t>
+      </w:r>
+      <w:r>
+        <w:rPr>
+          <w:b/>
+        </w:rPr>
+        <w:t>version</w:t>
+      </w:r>
+      <w:r>
+        <w:t xml:space="preserve"> of the activity: a copy of the activity, its indicators with their actions, and its budget lines, kept as it was. The first approval is </w:t>
+      </w:r>
+      <w:r>
+        <w:rPr>
+          <w:b/>
+        </w:rPr>
+        <w:t>version 1</w:t>
+      </w:r>
+      <w:r>
+        <w:t xml:space="preserve">; the </w:t>
+      </w:r>
+      <w:r>
+        <w:rPr>
+          <w:b/>
+        </w:rPr>
+        <w:t>amounts of the latest version are in force</w:t>
+      </w:r>
+      <w:r>
+        <w:t xml:space="preserve">, and spending is reported against them. On the activity's </w:t>
+      </w:r>
+      <w:r>
+        <w:rPr>
+          <w:b/>
+        </w:rPr>
+        <w:t>Workflow History</w:t>
+      </w:r>
+      <w:r>
+        <w:t xml:space="preserve"> tab, </w:t>
+      </w:r>
+      <w:r>
+        <w:rPr>
+          <w:i/>
+        </w:rPr>
+        <w:t>Approved versions</w:t>
+      </w:r>
+      <w:r>
+        <w:t xml:space="preserve"> lists every version with who approved it, when, the total, and the reason for the revision that made it; </w:t>
+      </w:r>
+      <w:r>
+        <w:rPr>
+          <w:i/>
+        </w:rPr>
+        <w:t>Show what was approved</w:t>
+      </w:r>
+      <w:r>
+        <w:t xml:space="preserve"> opens its budget lines and indicators.</w:t>
+      </w:r>
+    </w:p>
+    <w:p>
+      <w:pPr>
+        <w:pStyle w:val="Heading2"/>
+      </w:pPr>
+      <w:r>
+        <w:t>9.2 Start a revision</w:t>
+      </w:r>
+    </w:p>
+    <w:p>
+      <w:pPr>
+        <w:spacing w:after="120"/>
+      </w:pPr>
+      <w:r>
+        <w:t xml:space="preserve">On an approved activity, </w:t>
+      </w:r>
+      <w:r>
+        <w:rPr>
+          <w:i/>
+        </w:rPr>
+        <w:t xml:space="preserve">Governance Actions → </w:t>
+      </w:r>
+      <w:r>
+        <w:rPr>
+          <w:i/>
+        </w:rPr>
+        <w:t>Revise</w:t>
+      </w:r>
+      <w:r>
+        <w:rPr>
+          <w:b/>
+        </w:rPr>
+        <w:t xml:space="preserve">. Give a </w:t>
+      </w:r>
+      <w:r>
+        <w:t>reason** (required). It can be started by someone who prepares for the unit (its list of preparers, or anyone who may submit for it), the director of the unit, whoever gives the final approval, or an administrator.</w:t>
+      </w:r>
+    </w:p>
+    <w:p>
+      <w:pPr>
+        <w:pStyle w:val="ListBullet"/>
+      </w:pPr>
+      <w:r>
+        <w:t xml:space="preserve">The activity becomes a </w:t>
+      </w:r>
+      <w:r>
+        <w:rPr>
+          <w:b/>
+        </w:rPr>
+        <w:t>Draft</w:t>
+      </w:r>
+      <w:r>
+        <w:t xml:space="preserve"> that the unit can edit: amounts, lines, indicators, targets, actions, dates.</w:t>
+      </w:r>
+    </w:p>
+    <w:p>
+      <w:pPr>
+        <w:pStyle w:val="ListBullet"/>
+      </w:pPr>
+      <w:r>
+        <w:rPr>
+          <w:b/>
+        </w:rPr>
+        <w:t>The approved version stays in force</w:t>
+      </w:r>
+      <w:r>
+        <w:t>: its amounts are untouched, the activity keeps its place in the plan and its reports, and the unit keeps reporting spending against it.</w:t>
+      </w:r>
+    </w:p>
+    <w:p>
+      <w:pPr>
+        <w:pStyle w:val="ListBullet"/>
+      </w:pPr>
+      <w:r>
+        <w:t xml:space="preserve">A banner on the activity says </w:t>
+      </w:r>
+      <w:r>
+        <w:rPr>
+          <w:i/>
+        </w:rPr>
+        <w:t>Revision in progress: version 2</w:t>
+      </w:r>
+      <w:r>
+        <w:t xml:space="preserve"> and lists </w:t>
+      </w:r>
+      <w:r>
+        <w:rPr>
+          <w:b/>
+        </w:rPr>
+        <w:t>what changes against version 1</w:t>
+      </w:r>
+      <w:r>
+        <w:t>, line by line and indicator by indicator, with the total before and after, so that reviewers see exactly what they are approving.</w:t>
+      </w:r>
+    </w:p>
+    <w:p>
+      <w:r>
+        <w:drawing>
+          <wp:inline xmlns:a="http://schemas.openxmlformats.org/drawingml/2006/main" xmlns:pic="http://schemas.openxmlformats.org/drawingml/2006/picture">
+            <wp:extent cx="5832000" cy="3645000"/>
+            <wp:docPr id="18" name="Picture 18"/>
+            <wp:cNvGraphicFramePr>
+              <a:graphicFrameLocks noChangeAspect="1"/>
+            </wp:cNvGraphicFramePr>
+            <a:graphic>
+              <a:graphicData uri="http://schemas.openxmlformats.org/drawingml/2006/picture">
+                <pic:pic>
+                  <pic:nvPicPr>
+                    <pic:cNvPr id="0" name="activity-revision.png"/>
                     <pic:cNvPicPr/>
                   </pic:nvPicPr>
                   <pic:blipFill>
@@ -4890,7 +4978,15 @@
           <w:color w:val="7A8CA3"/>
           <w:sz w:val="17"/>
         </w:rPr>
-        <w:t>Envelope</w:t>
+        <w:t>A revision in progress</w:t>
+      </w:r>
+    </w:p>
+    <w:p>
+      <w:pPr>
+        <w:pStyle w:val="Heading2"/>
+      </w:pPr>
+      <w:r>
+        <w:t>9.3 Approve the revision</w:t>
       </w:r>
     </w:p>
     <w:p>
@@ -4898,66 +4994,99 @@
         <w:spacing w:after="120"/>
       </w:pPr>
       <w:r>
+        <w:t xml:space="preserve">The revision goes through </w:t>
+      </w:r>
+      <w:r>
         <w:rPr>
           <w:b/>
         </w:rPr>
-        <w:t>Budget → Fiscal Envelope → Current Envelope / Envelope List</w:t>
-      </w:r>
-      <w:r>
-        <w:t xml:space="preserve">: when the institution learns the amount it receives for the year, register the envelope: the fiscal year, the </w:t>
+        <w:t>the whole chain again</w:t>
+      </w:r>
+      <w:r>
+        <w:t xml:space="preserve">: prepared, certified (and validated by the unit above where that applies), and approved by the head of the directorate or the named approvers (including lists that sign in order; its signatures belong to a new round). Returning it for correction works as before. When the revision is approved it becomes </w:t>
       </w:r>
       <w:r>
         <w:rPr>
           <w:b/>
         </w:rPr>
-        <w:t>reference</w:t>
-      </w:r>
-      <w:r>
-        <w:t xml:space="preserve"> (the budget law, or the ministry's decision for a directorate), the source authority, the dates and the </w:t>
-      </w:r>
+        <w:t>version 2</w:t>
+      </w:r>
+      <w:r>
+        <w:t>: its amounts take over and the history shows both versions.</w:t>
+      </w:r>
+    </w:p>
+    <w:p>
+      <w:pPr>
+        <w:pStyle w:val="Heading2"/>
+      </w:pPr>
+      <w:r>
+        <w:t>9.4 What a revision cannot do</w:t>
+      </w:r>
+    </w:p>
+    <w:p>
+      <w:pPr>
+        <w:pStyle w:val="ListBullet"/>
+      </w:pPr>
       <w:r>
         <w:rPr>
           <w:b/>
         </w:rPr>
-        <w:t>total</w:t>
-      </w:r>
-      <w:r>
-        <w:t xml:space="preserve">. Divide it by </w:t>
-      </w:r>
+        <w:t>Remove a budget line that already has spending reported against it</w:t>
+      </w:r>
+      <w:r>
+        <w:t>, or an indicator that already has progress reported: change its amount or target instead. This keeps the reported figures tied to their line.</w:t>
+      </w:r>
+    </w:p>
+    <w:p>
+      <w:pPr>
+        <w:pStyle w:val="ListBullet"/>
+      </w:pPr>
       <w:r>
         <w:rPr>
           <w:b/>
         </w:rPr>
-        <w:t>economic category</w:t>
-      </w:r>
-      <w:r>
-        <w:t xml:space="preserve">. Approve it. Once the envelope is </w:t>
+        <w:t>Delete the activity</w:t>
+      </w:r>
+      <w:r>
+        <w:t>: an activity that was approved once is part of the record of the plan.</w:t>
+      </w:r>
+    </w:p>
+    <w:p>
+      <w:pPr>
+        <w:spacing w:after="120"/>
+      </w:pPr>
+      <w:r>
+        <w:t>Finalizing a directorate's plan (Part 8) does not stop revisions.</w:t>
+      </w:r>
+    </w:p>
+    <w:p>
+      <w:r>
+        <w:br w:type="page"/>
+      </w:r>
+    </w:p>
+    <w:p>
+      <w:pPr>
+        <w:pStyle w:val="Heading1"/>
+      </w:pPr>
+      <w:r>
+        <w:t>10. Executing and reporting</w:t>
+      </w:r>
+    </w:p>
+    <w:p>
+      <w:pPr>
+        <w:spacing w:after="120"/>
+      </w:pPr>
+      <w:r>
+        <w:t xml:space="preserve">Once an activity has an approved version, its unit reports what it spent and achieved. Figures count only once </w:t>
       </w:r>
       <w:r>
         <w:rPr>
           <w:b/>
         </w:rPr>
-        <w:t>Approved</w:t>
-      </w:r>
-      <w:r>
-        <w:t>, the plan for the year is final.</w:t>
-      </w:r>
-    </w:p>
-    <w:p>
-      <w:pPr>
-        <w:spacing w:after="120"/>
-      </w:pPr>
-      <w:r>
-        <w:t xml:space="preserve">The old step of a separate </w:t>
-      </w:r>
-      <w:r>
-        <w:rPr>
-          <w:i/>
-        </w:rPr>
-        <w:t>ceiling</w:t>
-      </w:r>
-      <w:r>
-        <w:t xml:space="preserve"> is now part of the envelope pages; there is no separate screen to maintain.</w:t>
+        <w:t>someone else verifies</w:t>
+      </w:r>
+      <w:r>
+        <w:t xml:space="preserve"> them.</w:t>
       </w:r>
     </w:p>
     <w:p>
@@ -4965,66 +5094,7 @@
         <w:pStyle w:val="Heading2"/>
       </w:pPr>
       <w:r>
-        <w:t>9.2 Distribute it over the plan</w:t>
-      </w:r>
-    </w:p>
-    <w:p>
-      <w:pPr>
-        <w:spacing w:after="120"/>
-      </w:pPr>
-      <w:r>
-        <w:t xml:space="preserve">Choose </w:t>
-      </w:r>
-      <w:r>
-        <w:rPr>
-          <w:b/>
-        </w:rPr>
-        <w:t>Redistribute OGE</w:t>
-      </w:r>
-      <w:r>
-        <w:t xml:space="preserve"> on the envelope page. The system shares the envelope over the </w:t>
-      </w:r>
-      <w:r>
-        <w:rPr>
-          <w:b/>
-        </w:rPr>
-        <w:t>approved</w:t>
-      </w:r>
-      <w:r>
-        <w:t xml:space="preserve"> activities only, line by line:</w:t>
-      </w:r>
-    </w:p>
-    <w:p>
-      <w:pPr>
-        <w:pStyle w:val="ListBullet"/>
-      </w:pPr>
-      <w:r>
-        <w:t>never above what a line asked for (a surplus stays unallocated);</w:t>
-      </w:r>
-    </w:p>
-    <w:p>
-      <w:pPr>
-        <w:pStyle w:val="ListBullet"/>
-      </w:pPr>
-      <w:r>
-        <w:t>cent-exact, in one transaction;</w:t>
-      </w:r>
-    </w:p>
-    <w:p>
-      <w:pPr>
-        <w:pStyle w:val="ListBullet"/>
-      </w:pPr>
-      <w:r>
-        <w:t xml:space="preserve">only for an </w:t>
-      </w:r>
-      <w:r>
-        <w:rPr>
-          <w:b/>
-        </w:rPr>
-        <w:t>Approved</w:t>
-      </w:r>
-      <w:r>
-        <w:t xml:space="preserve"> envelope.</w:t>
+        <w:t>10.1 Monthly spending</w:t>
       </w:r>
     </w:p>
     <w:p>
@@ -5032,7 +5102,7 @@
         <w:drawing>
           <wp:inline xmlns:a="http://schemas.openxmlformats.org/drawingml/2006/main" xmlns:pic="http://schemas.openxmlformats.org/drawingml/2006/picture">
             <wp:extent cx="5832000" cy="3645000"/>
-            <wp:docPr id="18" name="Picture 18"/>
+            <wp:docPr id="19" name="Picture 19"/>
             <wp:cNvGraphicFramePr>
               <a:graphicFrameLocks noChangeAspect="1"/>
             </wp:cNvGraphicFramePr>
@@ -5040,7 +5110,7 @@
               <a:graphicData uri="http://schemas.openxmlformats.org/drawingml/2006/picture">
                 <pic:pic>
                   <pic:nvPicPr>
-                    <pic:cNvPr id="0" name="allocation.png"/>
+                    <pic:cNvPr id="0" name="report-execution.png"/>
                     <pic:cNvPicPr/>
                   </pic:nvPicPr>
                   <pic:blipFill>
@@ -5070,7 +5140,7 @@
           <w:color w:val="7A8CA3"/>
           <w:sz w:val="17"/>
         </w:rPr>
-        <w:t>Allocation</w:t>
+        <w:t>Report execution</w:t>
       </w:r>
     </w:p>
     <w:p>
@@ -5081,32 +5151,54 @@
         <w:rPr>
           <w:b/>
         </w:rPr>
-        <w:t>Budget → Budget Allocation</w:t>
-      </w:r>
-      <w:r>
-        <w:t xml:space="preserve"> shows what each unit, programme and category received, against what it planned. </w:t>
+        <w:t>Execute → Report execution</w:t>
+      </w:r>
+      <w:r>
+        <w:t xml:space="preserve">: choose the </w:t>
       </w:r>
       <w:r>
         <w:rPr>
           <w:b/>
         </w:rPr>
-        <w:t>Budget → Allocation Review</w:t>
-      </w:r>
-      <w:r>
-        <w:t xml:space="preserve"> is where directors review how the envelope was allocated to their units.</w:t>
-      </w:r>
-    </w:p>
-    <w:p>
-      <w:r>
-        <w:br w:type="page"/>
-      </w:r>
-    </w:p>
-    <w:p>
-      <w:pPr>
-        <w:pStyle w:val="Heading1"/>
-      </w:pPr>
-      <w:r>
-        <w:t>10. Executing and reporting</w:t>
+        <w:t>month</w:t>
+      </w:r>
+      <w:r>
+        <w:t xml:space="preserve">, then an </w:t>
+      </w:r>
+      <w:r>
+        <w:rPr>
+          <w:b/>
+        </w:rPr>
+        <w:t>approved activity</w:t>
+      </w:r>
+      <w:r>
+        <w:t xml:space="preserve">. For each budget line enter what was </w:t>
+      </w:r>
+      <w:r>
+        <w:rPr>
+          <w:b/>
+        </w:rPr>
+        <w:t>committed</w:t>
+      </w:r>
+      <w:r>
+        <w:t xml:space="preserve"> and what was </w:t>
+      </w:r>
+      <w:r>
+        <w:rPr>
+          <w:b/>
+        </w:rPr>
+        <w:t>paid</w:t>
+      </w:r>
+      <w:r>
+        <w:t xml:space="preserve"> in that month, and submit. The month must be within its reporting window (Part 4.5).</w:t>
+      </w:r>
+    </w:p>
+    <w:p>
+      <w:pPr>
+        <w:pStyle w:val="Heading2"/>
+      </w:pPr>
+      <w:r>
+        <w:t>10.2 Quarterly indicators</w:t>
       </w:r>
     </w:p>
     <w:p>
@@ -5114,16 +5206,16 @@
         <w:spacing w:after="120"/>
       </w:pPr>
       <w:r>
-        <w:t xml:space="preserve">After the budget is distributed, the units report what they spent and achieved. Figures count only once </w:t>
+        <w:t xml:space="preserve">On the same screen, enter for each indicator the progress achieved in the </w:t>
       </w:r>
       <w:r>
         <w:rPr>
           <w:b/>
         </w:rPr>
-        <w:t>someone else verifies</w:t>
-      </w:r>
-      <w:r>
-        <w:t xml:space="preserve"> them.</w:t>
+        <w:t>quarter</w:t>
+      </w:r>
+      <w:r>
+        <w:t>; the quarter must be one the indicator is reported in (from its months).</w:t>
       </w:r>
     </w:p>
     <w:p>
@@ -5131,7 +5223,32 @@
         <w:pStyle w:val="Heading2"/>
       </w:pPr>
       <w:r>
-        <w:t>10.1 Monthly spending</w:t>
+        <w:t>10.3 Narratives</w:t>
+      </w:r>
+    </w:p>
+    <w:p>
+      <w:pPr>
+        <w:spacing w:after="120"/>
+      </w:pPr>
+      <w:r>
+        <w:t xml:space="preserve">For each month and quarter the unit writes the </w:t>
+      </w:r>
+      <w:r>
+        <w:rPr>
+          <w:b/>
+        </w:rPr>
+        <w:t>narrative</w:t>
+      </w:r>
+      <w:r>
+        <w:t>: results achieved, implementation constraints, and the rating (from the list). It is part of the report.</w:t>
+      </w:r>
+    </w:p>
+    <w:p>
+      <w:pPr>
+        <w:pStyle w:val="Heading2"/>
+      </w:pPr>
+      <w:r>
+        <w:t>10.4 Verification</w:t>
       </w:r>
     </w:p>
     <w:p>
@@ -5139,7 +5256,7 @@
         <w:drawing>
           <wp:inline xmlns:a="http://schemas.openxmlformats.org/drawingml/2006/main" xmlns:pic="http://schemas.openxmlformats.org/drawingml/2006/picture">
             <wp:extent cx="5832000" cy="3645000"/>
-            <wp:docPr id="19" name="Picture 19"/>
+            <wp:docPr id="20" name="Picture 20"/>
             <wp:cNvGraphicFramePr>
               <a:graphicFrameLocks noChangeAspect="1"/>
             </wp:cNvGraphicFramePr>
@@ -5147,7 +5264,7 @@
               <a:graphicData uri="http://schemas.openxmlformats.org/drawingml/2006/picture">
                 <pic:pic>
                   <pic:nvPicPr>
-                    <pic:cNvPr id="0" name="report-execution.png"/>
+                    <pic:cNvPr id="0" name="verify.png"/>
                     <pic:cNvPicPr/>
                   </pic:nvPicPr>
                   <pic:blipFill>
@@ -5177,57 +5294,96 @@
           <w:color w:val="7A8CA3"/>
           <w:sz w:val="17"/>
         </w:rPr>
+        <w:t>Verification</w:t>
+      </w:r>
+    </w:p>
+    <w:p>
+      <w:pPr>
+        <w:spacing w:after="120"/>
+      </w:pPr>
+      <w:r>
+        <w:t xml:space="preserve">A different person opens the figures and </w:t>
+      </w:r>
+      <w:r>
+        <w:rPr>
+          <w:b/>
+        </w:rPr>
+        <w:t>verifies or returns</w:t>
+      </w:r>
+      <w:r>
+        <w:t xml:space="preserve"> them:</w:t>
+      </w:r>
+    </w:p>
+    <w:p>
+      <w:pPr>
+        <w:pStyle w:val="ListBullet"/>
+      </w:pPr>
+      <w:r>
+        <w:rPr>
+          <w:b/>
+        </w:rPr>
+        <w:t>Spending (committed and paid)</w:t>
+      </w:r>
+      <w:r>
+        <w:t xml:space="preserve">: a director or the finance officer, from the items in </w:t>
+      </w:r>
+      <w:r>
+        <w:rPr>
+          <w:b/>
+        </w:rPr>
+        <w:t>Approvals</w:t>
+      </w:r>
+      <w:r>
+        <w:t xml:space="preserve"> or from </w:t>
+      </w:r>
+      <w:r>
+        <w:rPr>
+          <w:i/>
+        </w:rPr>
         <w:t>Report execution</w:t>
       </w:r>
+      <w:r>
+        <w:t>.</w:t>
+      </w:r>
+    </w:p>
+    <w:p>
+      <w:pPr>
+        <w:pStyle w:val="ListBullet"/>
+      </w:pPr>
+      <w:r>
+        <w:rPr>
+          <w:b/>
+        </w:rPr>
+        <w:t>Indicator progress</w:t>
+      </w:r>
+      <w:r>
+        <w:t xml:space="preserve">: a director from </w:t>
+      </w:r>
+      <w:r>
+        <w:rPr>
+          <w:i/>
+        </w:rPr>
+        <w:t>Report execution</w:t>
+      </w:r>
+      <w:r>
+        <w:t xml:space="preserve">; administrators also have the page </w:t>
+      </w:r>
+      <w:r>
+        <w:rPr>
+          <w:b/>
+        </w:rPr>
+        <w:t>Approvals → Verify progress</w:t>
+      </w:r>
+      <w:r>
+        <w:t>, which lists every pending record and can verify them together.</w:t>
+      </w:r>
     </w:p>
     <w:p>
       <w:pPr>
         <w:spacing w:after="120"/>
       </w:pPr>
       <w:r>
-        <w:rPr>
-          <w:b/>
-        </w:rPr>
-        <w:t>Execute → Report execution</w:t>
-      </w:r>
-      <w:r>
-        <w:t xml:space="preserve">: choose the </w:t>
-      </w:r>
-      <w:r>
-        <w:rPr>
-          <w:b/>
-        </w:rPr>
-        <w:t>month</w:t>
-      </w:r>
-      <w:r>
-        <w:t xml:space="preserve">, then an </w:t>
-      </w:r>
-      <w:r>
-        <w:rPr>
-          <w:b/>
-        </w:rPr>
-        <w:t>approved activity</w:t>
-      </w:r>
-      <w:r>
-        <w:t xml:space="preserve">. For each budget line enter what was </w:t>
-      </w:r>
-      <w:r>
-        <w:rPr>
-          <w:b/>
-        </w:rPr>
-        <w:t>committed</w:t>
-      </w:r>
-      <w:r>
-        <w:t xml:space="preserve"> and what was </w:t>
-      </w:r>
-      <w:r>
-        <w:rPr>
-          <w:b/>
-        </w:rPr>
-        <w:t>paid</w:t>
-      </w:r>
-      <w:r>
-        <w:t xml:space="preserve"> in that month, and submit. The month must be within its reporting window (Part 4.5).</w:t>
+        <w:t>Only verified figures appear in the dashboard, the performance report and the printed report. You cannot verify your own entry; the system says so.</w:t>
       </w:r>
     </w:p>
     <w:p>
@@ -5235,57 +5391,7 @@
         <w:pStyle w:val="Heading2"/>
       </w:pPr>
       <w:r>
-        <w:t>10.2 Quarterly indicators</w:t>
-      </w:r>
-    </w:p>
-    <w:p>
-      <w:pPr>
-        <w:spacing w:after="120"/>
-      </w:pPr>
-      <w:r>
-        <w:t xml:space="preserve">On the same screen, enter for each indicator the progress achieved in the </w:t>
-      </w:r>
-      <w:r>
-        <w:rPr>
-          <w:b/>
-        </w:rPr>
-        <w:t>quarter</w:t>
-      </w:r>
-      <w:r>
-        <w:t>; the quarter must be one the indicator is reported in (from its months).</w:t>
-      </w:r>
-    </w:p>
-    <w:p>
-      <w:pPr>
-        <w:pStyle w:val="Heading2"/>
-      </w:pPr>
-      <w:r>
-        <w:t>10.3 Narratives</w:t>
-      </w:r>
-    </w:p>
-    <w:p>
-      <w:pPr>
-        <w:spacing w:after="120"/>
-      </w:pPr>
-      <w:r>
-        <w:t xml:space="preserve">For each month and quarter the unit writes the </w:t>
-      </w:r>
-      <w:r>
-        <w:rPr>
-          <w:b/>
-        </w:rPr>
-        <w:t>narrative</w:t>
-      </w:r>
-      <w:r>
-        <w:t>: results achieved, implementation constraints, and the rating (from the list). It is part of the report.</w:t>
-      </w:r>
-    </w:p>
-    <w:p>
-      <w:pPr>
-        <w:pStyle w:val="Heading2"/>
-      </w:pPr>
-      <w:r>
-        <w:t>10.4 Verification</w:t>
+        <w:t>10.5 Compile the quarter</w:t>
       </w:r>
     </w:p>
     <w:p>
@@ -5293,7 +5399,7 @@
         <w:drawing>
           <wp:inline xmlns:a="http://schemas.openxmlformats.org/drawingml/2006/main" xmlns:pic="http://schemas.openxmlformats.org/drawingml/2006/picture">
             <wp:extent cx="5832000" cy="3645000"/>
-            <wp:docPr id="20" name="Picture 20"/>
+            <wp:docPr id="21" name="Picture 21"/>
             <wp:cNvGraphicFramePr>
               <a:graphicFrameLocks noChangeAspect="1"/>
             </wp:cNvGraphicFramePr>
@@ -5301,7 +5407,7 @@
               <a:graphicData uri="http://schemas.openxmlformats.org/drawingml/2006/picture">
                 <pic:pic>
                   <pic:nvPicPr>
-                    <pic:cNvPr id="0" name="verify.png"/>
+                    <pic:cNvPr id="0" name="compile.png"/>
                     <pic:cNvPicPr/>
                   </pic:nvPicPr>
                   <pic:blipFill>
@@ -5331,7 +5437,7 @@
           <w:color w:val="7A8CA3"/>
           <w:sz w:val="17"/>
         </w:rPr>
-        <w:t>Verification</w:t>
+        <w:t>Compile the quarter</w:t>
       </w:r>
     </w:p>
     <w:p>
@@ -5339,88 +5445,58 @@
         <w:spacing w:after="120"/>
       </w:pPr>
       <w:r>
-        <w:t xml:space="preserve">A different person opens the figures and </w:t>
-      </w:r>
-      <w:r>
         <w:rPr>
           <w:b/>
         </w:rPr>
-        <w:t>verifies or returns</w:t>
-      </w:r>
-      <w:r>
-        <w:t xml:space="preserve"> them:</w:t>
-      </w:r>
-    </w:p>
-    <w:p>
-      <w:pPr>
-        <w:pStyle w:val="ListBullet"/>
-      </w:pPr>
+        <w:t>Execute → Compile the quarter</w:t>
+      </w:r>
+      <w:r>
+        <w:t xml:space="preserve"> (directors and administrators): choose the </w:t>
+      </w:r>
       <w:r>
         <w:rPr>
           <w:b/>
         </w:rPr>
-        <w:t>Spending (committed and paid)</w:t>
-      </w:r>
-      <w:r>
-        <w:t xml:space="preserve">: a director or the finance officer, from the items in </w:t>
+        <w:t>quarter</w:t>
+      </w:r>
+      <w:r>
+        <w:t xml:space="preserve">. For each activity the system shows what the unit reported; press </w:t>
       </w:r>
       <w:r>
         <w:rPr>
           <w:b/>
         </w:rPr>
-        <w:t>Approvals</w:t>
-      </w:r>
-      <w:r>
-        <w:t xml:space="preserve"> or from </w:t>
+        <w:t>Draft from the reports</w:t>
+      </w:r>
+      <w:r>
+        <w:t xml:space="preserve"> to prepare the text (</w:t>
       </w:r>
       <w:r>
         <w:rPr>
           <w:i/>
         </w:rPr>
-        <w:t>Report execution</w:t>
-      </w:r>
-      <w:r>
-        <w:t>.</w:t>
-      </w:r>
-    </w:p>
-    <w:p>
-      <w:pPr>
-        <w:pStyle w:val="ListBullet"/>
-      </w:pPr>
+        <w:t>Results achieved</w:t>
+      </w:r>
+      <w:r>
+        <w:t xml:space="preserve"> and </w:t>
+      </w:r>
+      <w:r>
+        <w:rPr>
+          <w:i/>
+        </w:rPr>
+        <w:t>Implementation constraints</w:t>
+      </w:r>
+      <w:r>
+        <w:t xml:space="preserve">), edit it, and </w:t>
+      </w:r>
       <w:r>
         <w:rPr>
           <w:b/>
         </w:rPr>
-        <w:t>Indicator progress</w:t>
-      </w:r>
-      <w:r>
-        <w:t xml:space="preserve">: a director from </w:t>
-      </w:r>
-      <w:r>
-        <w:rPr>
-          <w:i/>
-        </w:rPr>
-        <w:t>Report execution</w:t>
-      </w:r>
-      <w:r>
-        <w:t xml:space="preserve">; administrators also have the page </w:t>
-      </w:r>
-      <w:r>
-        <w:rPr>
-          <w:b/>
-        </w:rPr>
-        <w:t>Approvals → Verify progress</w:t>
-      </w:r>
-      <w:r>
-        <w:t>, which lists every pending record and can verify them together.</w:t>
-      </w:r>
-    </w:p>
-    <w:p>
-      <w:pPr>
-        <w:spacing w:after="120"/>
-      </w:pPr>
-      <w:r>
-        <w:t>Only verified figures appear in the dashboard, the performance report and the printed report. You cannot verify your own entry; the system says so.</w:t>
+        <w:t>Save</w:t>
+      </w:r>
+      <w:r>
+        <w:t>. What the unit wrote is kept as it was. This becomes the text of the ministry's report.</w:t>
       </w:r>
     </w:p>
     <w:p>
@@ -5428,7 +5504,7 @@
         <w:pStyle w:val="Heading2"/>
       </w:pPr>
       <w:r>
-        <w:t>10.5 Compile the quarter</w:t>
+        <w:t>10.6 Performance</w:t>
       </w:r>
     </w:p>
     <w:p>
@@ -5436,7 +5512,7 @@
         <w:drawing>
           <wp:inline xmlns:a="http://schemas.openxmlformats.org/drawingml/2006/main" xmlns:pic="http://schemas.openxmlformats.org/drawingml/2006/picture">
             <wp:extent cx="5832000" cy="3645000"/>
-            <wp:docPr id="21" name="Picture 21"/>
+            <wp:docPr id="22" name="Picture 22"/>
             <wp:cNvGraphicFramePr>
               <a:graphicFrameLocks noChangeAspect="1"/>
             </wp:cNvGraphicFramePr>
@@ -5444,7 +5520,7 @@
               <a:graphicData uri="http://schemas.openxmlformats.org/drawingml/2006/picture">
                 <pic:pic>
                   <pic:nvPicPr>
-                    <pic:cNvPr id="0" name="compile.png"/>
+                    <pic:cNvPr id="0" name="performance.png"/>
                     <pic:cNvPicPr/>
                   </pic:nvPicPr>
                   <pic:blipFill>
@@ -5474,7 +5550,7 @@
           <w:color w:val="7A8CA3"/>
           <w:sz w:val="17"/>
         </w:rPr>
-        <w:t>Compile the quarter</w:t>
+        <w:t>Performance</w:t>
       </w:r>
     </w:p>
     <w:p>
@@ -5485,55 +5561,84 @@
         <w:rPr>
           <w:b/>
         </w:rPr>
-        <w:t>Execute → Compile the quarter</w:t>
-      </w:r>
-      <w:r>
-        <w:t xml:space="preserve"> (directors and administrators): choose the </w:t>
+        <w:t>Insights → Performance</w:t>
+      </w:r>
+      <w:r>
+        <w:t>: paid and delivered against the plan, by quarter and programme, with the activities falling behind.</w:t>
+      </w:r>
+    </w:p>
+    <w:p>
+      <w:r>
+        <w:br w:type="page"/>
+      </w:r>
+    </w:p>
+    <w:p>
+      <w:pPr>
+        <w:pStyle w:val="Heading1"/>
+      </w:pPr>
+      <w:r>
+        <w:t>11. Reports, dashboard and printed forms</w:t>
+      </w:r>
+    </w:p>
+    <w:p>
+      <w:pPr>
+        <w:pStyle w:val="Heading2"/>
+      </w:pPr>
+      <w:r>
+        <w:t>11.1 The dashboard and Reporting page</w:t>
+      </w:r>
+    </w:p>
+    <w:p>
+      <w:pPr>
+        <w:spacing w:after="120"/>
+      </w:pPr>
+      <w:r>
+        <w:t xml:space="preserve">The </w:t>
       </w:r>
       <w:r>
         <w:rPr>
           <w:b/>
         </w:rPr>
-        <w:t>quarter</w:t>
-      </w:r>
-      <w:r>
-        <w:t xml:space="preserve">. For each activity the system shows what the unit reported; press </w:t>
+        <w:t>Dashboard</w:t>
+      </w:r>
+      <w:r>
+        <w:t xml:space="preserve"> (Part 1.3) and </w:t>
       </w:r>
       <w:r>
         <w:rPr>
           <w:b/>
         </w:rPr>
-        <w:t>Draft from the reports</w:t>
-      </w:r>
-      <w:r>
-        <w:t xml:space="preserve"> to prepare the text (</w:t>
-      </w:r>
-      <w:r>
-        <w:rPr>
-          <w:i/>
-        </w:rPr>
-        <w:t>Results achieved</w:t>
+        <w:t>Insights → Reporting</w:t>
+      </w:r>
+      <w:r>
+        <w:t xml:space="preserve"> show the annual performance report: planned and approved by unit, rolled up the tree, with </w:t>
+      </w:r>
+      <w:r>
+        <w:rPr>
+          <w:b/>
+        </w:rPr>
+        <w:t>Export Data</w:t>
+      </w:r>
+      <w:r>
+        <w:t xml:space="preserve"> (CSV), </w:t>
+      </w:r>
+      <w:r>
+        <w:rPr>
+          <w:b/>
+        </w:rPr>
+        <w:t>Final plan report</w:t>
       </w:r>
       <w:r>
         <w:t xml:space="preserve"> and </w:t>
       </w:r>
       <w:r>
         <w:rPr>
-          <w:i/>
-        </w:rPr>
-        <w:t>Implementation constraints</w:t>
-      </w:r>
-      <w:r>
-        <w:t xml:space="preserve">), edit it, and </w:t>
-      </w:r>
-      <w:r>
-        <w:rPr>
           <w:b/>
         </w:rPr>
-        <w:t>Save</w:t>
-      </w:r>
-      <w:r>
-        <w:t>. What the unit wrote is kept as it was. This becomes the text of the ministry's report.</w:t>
+        <w:t>Print Report</w:t>
+      </w:r>
+      <w:r>
+        <w:t>.</w:t>
       </w:r>
     </w:p>
     <w:p>
@@ -5541,7 +5646,7 @@
         <w:pStyle w:val="Heading2"/>
       </w:pPr>
       <w:r>
-        <w:t>10.6 Performance</w:t>
+        <w:t>11.2 The final plan report</w:t>
       </w:r>
     </w:p>
     <w:p>
@@ -5549,7 +5654,7 @@
         <w:drawing>
           <wp:inline xmlns:a="http://schemas.openxmlformats.org/drawingml/2006/main" xmlns:pic="http://schemas.openxmlformats.org/drawingml/2006/picture">
             <wp:extent cx="5832000" cy="3645000"/>
-            <wp:docPr id="22" name="Picture 22"/>
+            <wp:docPr id="23" name="Picture 23"/>
             <wp:cNvGraphicFramePr>
               <a:graphicFrameLocks noChangeAspect="1"/>
             </wp:cNvGraphicFramePr>
@@ -5557,7 +5662,7 @@
               <a:graphicData uri="http://schemas.openxmlformats.org/drawingml/2006/picture">
                 <pic:pic>
                   <pic:nvPicPr>
-                    <pic:cNvPr id="0" name="performance.png"/>
+                    <pic:cNvPr id="0" name="approved-plan.png"/>
                     <pic:cNvPicPr/>
                   </pic:nvPicPr>
                   <pic:blipFill>
@@ -5587,7 +5692,7 @@
           <w:color w:val="7A8CA3"/>
           <w:sz w:val="17"/>
         </w:rPr>
-        <w:t>Performance</w:t>
+        <w:t>The approved plan report</w:t>
       </w:r>
     </w:p>
     <w:p>
@@ -5598,23 +5703,54 @@
         <w:rPr>
           <w:b/>
         </w:rPr>
-        <w:t>Insights → Performance</w:t>
-      </w:r>
-      <w:r>
-        <w:t>: paid and delivered against the plan, by quarter and programme, with the activities falling behind.</w:t>
-      </w:r>
-    </w:p>
-    <w:p>
-      <w:r>
-        <w:br w:type="page"/>
-      </w:r>
-    </w:p>
-    <w:p>
-      <w:pPr>
-        <w:pStyle w:val="Heading1"/>
-      </w:pPr>
-      <w:r>
-        <w:t>11. Reports, dashboard and printed forms</w:t>
+        <w:t>Reporting → Final plan report</w:t>
+      </w:r>
+      <w:r>
+        <w:t xml:space="preserve"> is the plan of approved activities in the layout of the Ministry of Finance form (A4 landscape): programme and subprogramme bands, each activity with its indicators, baseline, target, means of verification, unit, funding source, the quarterly implementation schedule and the amount by economic category. It carries a document reference and a fingerprint so that a printed copy can be checked.</w:t>
+      </w:r>
+    </w:p>
+    <w:p>
+      <w:pPr>
+        <w:spacing w:after="120"/>
+      </w:pPr>
+      <w:r>
+        <w:t xml:space="preserve">Choose </w:t>
+      </w:r>
+      <w:r>
+        <w:rPr>
+          <w:b/>
+        </w:rPr>
+        <w:t>Complete report</w:t>
+      </w:r>
+      <w:r>
+        <w:t xml:space="preserve"> or </w:t>
+      </w:r>
+      <w:r>
+        <w:rPr>
+          <w:b/>
+        </w:rPr>
+        <w:t>Summary</w:t>
+      </w:r>
+      <w:r>
+        <w:t xml:space="preserve"> from the selector. </w:t>
+      </w:r>
+      <w:r>
+        <w:rPr>
+          <w:b/>
+        </w:rPr>
+        <w:t>Print</w:t>
+      </w:r>
+      <w:r>
+        <w:t xml:space="preserve"> to paper or </w:t>
+      </w:r>
+      <w:r>
+        <w:rPr>
+          <w:b/>
+        </w:rPr>
+        <w:t>Download PDF</w:t>
+      </w:r>
+      <w:r>
+        <w:t>. The report is of the plan; it is not addressed to anyone.</w:t>
       </w:r>
     </w:p>
     <w:p>
@@ -5622,68 +5758,7 @@
         <w:pStyle w:val="Heading2"/>
       </w:pPr>
       <w:r>
-        <w:t>11.1 The dashboard and Reporting page</w:t>
-      </w:r>
-    </w:p>
-    <w:p>
-      <w:pPr>
-        <w:spacing w:after="120"/>
-      </w:pPr>
-      <w:r>
-        <w:t xml:space="preserve">The </w:t>
-      </w:r>
-      <w:r>
-        <w:rPr>
-          <w:b/>
-        </w:rPr>
-        <w:t>Dashboard</w:t>
-      </w:r>
-      <w:r>
-        <w:t xml:space="preserve"> (Part 1.3) and </w:t>
-      </w:r>
-      <w:r>
-        <w:rPr>
-          <w:b/>
-        </w:rPr>
-        <w:t>Insights → Reporting</w:t>
-      </w:r>
-      <w:r>
-        <w:t xml:space="preserve"> show the annual performance report: planned and approved by unit, rolled up the tree, with </w:t>
-      </w:r>
-      <w:r>
-        <w:rPr>
-          <w:b/>
-        </w:rPr>
-        <w:t>Export Data</w:t>
-      </w:r>
-      <w:r>
-        <w:t xml:space="preserve"> (CSV), </w:t>
-      </w:r>
-      <w:r>
-        <w:rPr>
-          <w:b/>
-        </w:rPr>
-        <w:t>Final plan report</w:t>
-      </w:r>
-      <w:r>
-        <w:t xml:space="preserve"> and </w:t>
-      </w:r>
-      <w:r>
-        <w:rPr>
-          <w:b/>
-        </w:rPr>
-        <w:t>Print Report</w:t>
-      </w:r>
-      <w:r>
-        <w:t>.</w:t>
-      </w:r>
-    </w:p>
-    <w:p>
-      <w:pPr>
-        <w:pStyle w:val="Heading2"/>
-      </w:pPr>
-      <w:r>
-        <w:t>11.2 The final plan report</w:t>
+        <w:t>11.3 The implementation plan, per unit</w:t>
       </w:r>
     </w:p>
     <w:p>
@@ -5691,7 +5766,7 @@
         <w:drawing>
           <wp:inline xmlns:a="http://schemas.openxmlformats.org/drawingml/2006/main" xmlns:pic="http://schemas.openxmlformats.org/drawingml/2006/picture">
             <wp:extent cx="5832000" cy="3645000"/>
-            <wp:docPr id="23" name="Picture 23"/>
+            <wp:docPr id="24" name="Picture 24"/>
             <wp:cNvGraphicFramePr>
               <a:graphicFrameLocks noChangeAspect="1"/>
             </wp:cNvGraphicFramePr>
@@ -5699,7 +5774,7 @@
               <a:graphicData uri="http://schemas.openxmlformats.org/drawingml/2006/picture">
                 <pic:pic>
                   <pic:nvPicPr>
-                    <pic:cNvPr id="0" name="approved-plan.png"/>
+                    <pic:cNvPr id="0" name="implementation-plan.png"/>
                     <pic:cNvPicPr/>
                   </pic:nvPicPr>
                   <pic:blipFill>
@@ -5729,118 +5804,6 @@
           <w:color w:val="7A8CA3"/>
           <w:sz w:val="17"/>
         </w:rPr>
-        <w:t>The approved plan report</w:t>
-      </w:r>
-    </w:p>
-    <w:p>
-      <w:pPr>
-        <w:spacing w:after="120"/>
-      </w:pPr>
-      <w:r>
-        <w:rPr>
-          <w:b/>
-        </w:rPr>
-        <w:t>Reporting → Final plan report</w:t>
-      </w:r>
-      <w:r>
-        <w:t xml:space="preserve"> is the plan of approved activities in the layout of the Ministry of Finance form (A4 landscape): programme and subprogramme bands, each activity with its indicators, baseline, target, means of verification, unit, funding source, the quarterly implementation schedule and the amount by economic category. It carries a document reference and a fingerprint so that a printed copy can be checked.</w:t>
-      </w:r>
-    </w:p>
-    <w:p>
-      <w:pPr>
-        <w:spacing w:after="120"/>
-      </w:pPr>
-      <w:r>
-        <w:t xml:space="preserve">Choose </w:t>
-      </w:r>
-      <w:r>
-        <w:rPr>
-          <w:b/>
-        </w:rPr>
-        <w:t>Complete report</w:t>
-      </w:r>
-      <w:r>
-        <w:t xml:space="preserve"> or </w:t>
-      </w:r>
-      <w:r>
-        <w:rPr>
-          <w:b/>
-        </w:rPr>
-        <w:t>Summary</w:t>
-      </w:r>
-      <w:r>
-        <w:t xml:space="preserve"> from the selector. </w:t>
-      </w:r>
-      <w:r>
-        <w:rPr>
-          <w:b/>
-        </w:rPr>
-        <w:t>Print</w:t>
-      </w:r>
-      <w:r>
-        <w:t xml:space="preserve"> to paper or </w:t>
-      </w:r>
-      <w:r>
-        <w:rPr>
-          <w:b/>
-        </w:rPr>
-        <w:t>Download PDF</w:t>
-      </w:r>
-      <w:r>
-        <w:t>. The report is of the plan; it is not addressed to anyone.</w:t>
-      </w:r>
-    </w:p>
-    <w:p>
-      <w:pPr>
-        <w:pStyle w:val="Heading2"/>
-      </w:pPr>
-      <w:r>
-        <w:t>11.3 The implementation plan, per unit</w:t>
-      </w:r>
-    </w:p>
-    <w:p>
-      <w:r>
-        <w:drawing>
-          <wp:inline xmlns:a="http://schemas.openxmlformats.org/drawingml/2006/main" xmlns:pic="http://schemas.openxmlformats.org/drawingml/2006/picture">
-            <wp:extent cx="5832000" cy="3645000"/>
-            <wp:docPr id="24" name="Picture 24"/>
-            <wp:cNvGraphicFramePr>
-              <a:graphicFrameLocks noChangeAspect="1"/>
-            </wp:cNvGraphicFramePr>
-            <a:graphic>
-              <a:graphicData uri="http://schemas.openxmlformats.org/drawingml/2006/picture">
-                <pic:pic>
-                  <pic:nvPicPr>
-                    <pic:cNvPr id="0" name="implementation-plan.png"/>
-                    <pic:cNvPicPr/>
-                  </pic:nvPicPr>
-                  <pic:blipFill>
-                    <a:blip r:embed="rId32"/>
-                    <a:stretch>
-                      <a:fillRect/>
-                    </a:stretch>
-                  </pic:blipFill>
-                  <pic:spPr>
-                    <a:xfrm>
-                      <a:off x="0" y="0"/>
-                      <a:ext cx="5832000" cy="3645000"/>
-                    </a:xfrm>
-                    <a:prstGeom prst="rect"/>
-                  </pic:spPr>
-                </pic:pic>
-              </a:graphicData>
-            </a:graphic>
-          </wp:inline>
-        </w:drawing>
-      </w:r>
-    </w:p>
-    <w:p>
-      <w:r>
-        <w:rPr>
-          <w:i/>
-          <w:color w:val="7A8CA3"/>
-          <w:sz w:val="17"/>
-        </w:rPr>
         <w:t>Implementation plan</w:t>
       </w:r>
     </w:p>
@@ -6345,16 +6308,7 @@
         <w:ind w:left="510" w:hanging="397"/>
       </w:pPr>
       <w:r>
-        <w:t xml:space="preserve">14.  When the institution learns what it receives, Eva registers the </w:t>
-      </w:r>
-      <w:r>
-        <w:rPr>
-          <w:b/>
-        </w:rPr>
-        <w:t>fiscal envelope</w:t>
-      </w:r>
-      <w:r>
-        <w:t>, divides it by category and approves it.</w:t>
+        <w:t>14.  The plan is now in force: the amounts of each approved activity are what its unit may spend.</w:t>
       </w:r>
     </w:p>
     <w:p>
@@ -6363,16 +6317,16 @@
         <w:ind w:left="510" w:hanging="397"/>
       </w:pPr>
       <w:r>
-        <w:t xml:space="preserve">15.  She presses </w:t>
+        <w:t xml:space="preserve">15.  When something has to change (a cost went up, an action was added), the unit opens the approved activity, presses </w:t>
       </w:r>
       <w:r>
         <w:rPr>
           <w:b/>
         </w:rPr>
-        <w:t>Redistribute OGE</w:t>
-      </w:r>
-      <w:r>
-        <w:t>: the envelope is shared over the approved plan.</w:t>
+        <w:t>Revise</w:t>
+      </w:r>
+      <w:r>
+        <w:t xml:space="preserve"> and gives the reason; the activity is edited and goes through the chain again, while version 1 stays in force.</w:t>
       </w:r>
     </w:p>
     <w:p>
@@ -6381,16 +6335,16 @@
         <w:ind w:left="510" w:hanging="397"/>
       </w:pPr>
       <w:r>
-        <w:t xml:space="preserve">16.  The directors open </w:t>
+        <w:t xml:space="preserve">16.  Carla approves the revision; it becomes </w:t>
       </w:r>
       <w:r>
         <w:rPr>
           <w:b/>
         </w:rPr>
-        <w:t>Allocation Review</w:t>
-      </w:r>
-      <w:r>
-        <w:t xml:space="preserve"> and check what their units received.</w:t>
+        <w:t>version 2</w:t>
+      </w:r>
+      <w:r>
+        <w:t>, and the history shows both.</w:t>
       </w:r>
     </w:p>
     <w:p>
@@ -6706,7 +6660,7 @@
                     <pic:cNvPicPr/>
                   </pic:nvPicPr>
                   <pic:blipFill>
-                    <a:blip r:embed="rId33"/>
+                    <a:blip r:embed="rId32"/>
                     <a:stretch>
                       <a:fillRect/>
                     </a:stretch>
@@ -7944,160 +7898,7 @@
               <w:rPr>
                 <w:sz w:val="18"/>
               </w:rPr>
-              <w:t>Register / approve the envelope</w:t>
-            </w:r>
-          </w:p>
-        </w:tc>
-        <w:tc>
-          <w:tcPr>
-            <w:tcW w:type="dxa" w:w="1377"/>
-          </w:tcPr>
-          <w:p>
-            <w:r/>
-            <w:r>
-              <w:rPr>
-                <w:sz w:val="18"/>
-              </w:rPr>
-              <w:t>✔</w:t>
-            </w:r>
-          </w:p>
-        </w:tc>
-        <w:tc>
-          <w:tcPr>
-            <w:tcW w:type="dxa" w:w="1377"/>
-          </w:tcPr>
-          <w:p>
-            <w:r/>
-            <w:r>
-              <w:rPr>
-                <w:sz w:val="18"/>
-              </w:rPr>
-              <w:t>✔ (approves)</w:t>
-            </w:r>
-          </w:p>
-        </w:tc>
-        <w:tc>
-          <w:tcPr>
-            <w:tcW w:type="dxa" w:w="1377"/>
-          </w:tcPr>
-          <w:p>
-            <w:r/>
-          </w:p>
-        </w:tc>
-        <w:tc>
-          <w:tcPr>
-            <w:tcW w:type="dxa" w:w="1377"/>
-          </w:tcPr>
-          <w:p>
-            <w:r/>
-          </w:p>
-        </w:tc>
-        <w:tc>
-          <w:tcPr>
-            <w:tcW w:type="dxa" w:w="1377"/>
-          </w:tcPr>
-          <w:p>
-            <w:r/>
-          </w:p>
-        </w:tc>
-        <w:tc>
-          <w:tcPr>
-            <w:tcW w:type="dxa" w:w="1377"/>
-          </w:tcPr>
-          <w:p>
-            <w:r/>
-          </w:p>
-        </w:tc>
-      </w:tr>
-      <w:tr>
-        <w:tc>
-          <w:tcPr>
-            <w:tcW w:type="dxa" w:w="1377"/>
-            <w:shd w:val="clear" w:color="auto" w:fill="F5F8FB"/>
-          </w:tcPr>
-          <w:p>
-            <w:r/>
-            <w:r>
-              <w:rPr>
-                <w:sz w:val="18"/>
-              </w:rPr>
-              <w:t>Distribute the envelope</w:t>
-            </w:r>
-          </w:p>
-        </w:tc>
-        <w:tc>
-          <w:tcPr>
-            <w:tcW w:type="dxa" w:w="1377"/>
-            <w:shd w:val="clear" w:color="auto" w:fill="F5F8FB"/>
-          </w:tcPr>
-          <w:p>
-            <w:r/>
-            <w:r>
-              <w:rPr>
-                <w:sz w:val="18"/>
-              </w:rPr>
-              <w:t>✔</w:t>
-            </w:r>
-          </w:p>
-        </w:tc>
-        <w:tc>
-          <w:tcPr>
-            <w:tcW w:type="dxa" w:w="1377"/>
-            <w:shd w:val="clear" w:color="auto" w:fill="F5F8FB"/>
-          </w:tcPr>
-          <w:p>
-            <w:r/>
-          </w:p>
-        </w:tc>
-        <w:tc>
-          <w:tcPr>
-            <w:tcW w:type="dxa" w:w="1377"/>
-            <w:shd w:val="clear" w:color="auto" w:fill="F5F8FB"/>
-          </w:tcPr>
-          <w:p>
-            <w:r/>
-          </w:p>
-        </w:tc>
-        <w:tc>
-          <w:tcPr>
-            <w:tcW w:type="dxa" w:w="1377"/>
-            <w:shd w:val="clear" w:color="auto" w:fill="F5F8FB"/>
-          </w:tcPr>
-          <w:p>
-            <w:r/>
-          </w:p>
-        </w:tc>
-        <w:tc>
-          <w:tcPr>
-            <w:tcW w:type="dxa" w:w="1377"/>
-            <w:shd w:val="clear" w:color="auto" w:fill="F5F8FB"/>
-          </w:tcPr>
-          <w:p>
-            <w:r/>
-          </w:p>
-        </w:tc>
-        <w:tc>
-          <w:tcPr>
-            <w:tcW w:type="dxa" w:w="1377"/>
-            <w:shd w:val="clear" w:color="auto" w:fill="F5F8FB"/>
-          </w:tcPr>
-          <w:p>
-            <w:r/>
-          </w:p>
-        </w:tc>
-      </w:tr>
-      <w:tr>
-        <w:tc>
-          <w:tcPr>
-            <w:tcW w:type="dxa" w:w="1377"/>
-          </w:tcPr>
-          <w:p>
-            <w:r/>
-            <w:r>
-              <w:rPr>
-                <w:sz w:val="18"/>
-              </w:rPr>
-              <w:t>Report execution</w:t>
+              <w:t>Start a revision of an approved activity</w:t>
             </w:r>
           </w:p>
         </w:tc>
@@ -8147,7 +7948,7 @@
               <w:rPr>
                 <w:sz w:val="18"/>
               </w:rPr>
-              <w:t>✔</w:t>
+              <w:t>✔ (own unit)</w:t>
             </w:r>
           </w:p>
         </w:tc>
@@ -8180,7 +7981,7 @@
               <w:rPr>
                 <w:sz w:val="18"/>
               </w:rPr>
-              <w:t>Verify spending</w:t>
+              <w:t>Report execution</w:t>
             </w:r>
           </w:p>
         </w:tc>
@@ -8230,6 +8031,12 @@
           </w:tcPr>
           <w:p>
             <w:r/>
+            <w:r>
+              <w:rPr>
+                <w:sz w:val="18"/>
+              </w:rPr>
+              <w:t>✔</w:t>
+            </w:r>
           </w:p>
         </w:tc>
         <w:tc>
@@ -8239,12 +8046,6 @@
           </w:tcPr>
           <w:p>
             <w:r/>
-            <w:r>
-              <w:rPr>
-                <w:sz w:val="18"/>
-              </w:rPr>
-              <w:t>✔</w:t>
-            </w:r>
           </w:p>
         </w:tc>
         <w:tc>
@@ -8268,7 +8069,7 @@
               <w:rPr>
                 <w:sz w:val="18"/>
               </w:rPr>
-              <w:t>Verify indicator progress</w:t>
+              <w:t>Verify spending</w:t>
             </w:r>
           </w:p>
         </w:tc>
@@ -8322,6 +8123,12 @@
           </w:tcPr>
           <w:p>
             <w:r/>
+            <w:r>
+              <w:rPr>
+                <w:sz w:val="18"/>
+              </w:rPr>
+              <w:t>✔</w:t>
+            </w:r>
           </w:p>
         </w:tc>
         <w:tc>
@@ -8345,7 +8152,7 @@
               <w:rPr>
                 <w:sz w:val="18"/>
               </w:rPr>
-              <w:t>Compile the quarter</w:t>
+              <w:t>Verify indicator progress</w:t>
             </w:r>
           </w:p>
         </w:tc>
@@ -8427,7 +8234,7 @@
               <w:rPr>
                 <w:sz w:val="18"/>
               </w:rPr>
-              <w:t>Reports (view, print)</w:t>
+              <w:t>Compile the quarter</w:t>
             </w:r>
           </w:p>
         </w:tc>
@@ -8451,12 +8258,6 @@
           </w:tcPr>
           <w:p>
             <w:r/>
-            <w:r>
-              <w:rPr>
-                <w:sz w:val="18"/>
-              </w:rPr>
-              <w:t>✔</w:t>
-            </w:r>
           </w:p>
         </w:tc>
         <w:tc>
@@ -8479,12 +8280,6 @@
           </w:tcPr>
           <w:p>
             <w:r/>
-            <w:r>
-              <w:rPr>
-                <w:sz w:val="18"/>
-              </w:rPr>
-              <w:t>✔</w:t>
-            </w:r>
           </w:p>
         </w:tc>
         <w:tc>
@@ -8493,12 +8288,6 @@
           </w:tcPr>
           <w:p>
             <w:r/>
-            <w:r>
-              <w:rPr>
-                <w:sz w:val="18"/>
-              </w:rPr>
-              <w:t>✔</w:t>
-            </w:r>
           </w:p>
         </w:tc>
         <w:tc>
@@ -8507,12 +8296,6 @@
           </w:tcPr>
           <w:p>
             <w:r/>
-            <w:r>
-              <w:rPr>
-                <w:sz w:val="18"/>
-              </w:rPr>
-              <w:t>✔</w:t>
-            </w:r>
           </w:p>
         </w:tc>
       </w:tr>
@@ -8528,7 +8311,7 @@
               <w:rPr>
                 <w:sz w:val="18"/>
               </w:rPr>
-              <w:t>Users, structure, settings, windows, import</w:t>
+              <w:t>Reports (view, print)</w:t>
             </w:r>
           </w:p>
         </w:tc>
@@ -8554,6 +8337,12 @@
           </w:tcPr>
           <w:p>
             <w:r/>
+            <w:r>
+              <w:rPr>
+                <w:sz w:val="18"/>
+              </w:rPr>
+              <w:t>✔</w:t>
+            </w:r>
           </w:p>
         </w:tc>
         <w:tc>
@@ -8563,6 +8352,12 @@
           </w:tcPr>
           <w:p>
             <w:r/>
+            <w:r>
+              <w:rPr>
+                <w:sz w:val="18"/>
+              </w:rPr>
+              <w:t>✔</w:t>
+            </w:r>
           </w:p>
         </w:tc>
         <w:tc>
@@ -8572,6 +8367,12 @@
           </w:tcPr>
           <w:p>
             <w:r/>
+            <w:r>
+              <w:rPr>
+                <w:sz w:val="18"/>
+              </w:rPr>
+              <w:t>✔</w:t>
+            </w:r>
           </w:p>
         </w:tc>
         <w:tc>
@@ -8581,6 +8382,12 @@
           </w:tcPr>
           <w:p>
             <w:r/>
+            <w:r>
+              <w:rPr>
+                <w:sz w:val="18"/>
+              </w:rPr>
+              <w:t>✔</w:t>
+            </w:r>
           </w:p>
         </w:tc>
         <w:tc>
@@ -8590,6 +8397,82 @@
           </w:tcPr>
           <w:p>
             <w:r/>
+            <w:r>
+              <w:rPr>
+                <w:sz w:val="18"/>
+              </w:rPr>
+              <w:t>✔</w:t>
+            </w:r>
+          </w:p>
+        </w:tc>
+      </w:tr>
+      <w:tr>
+        <w:tc>
+          <w:tcPr>
+            <w:tcW w:type="dxa" w:w="1377"/>
+          </w:tcPr>
+          <w:p>
+            <w:r/>
+            <w:r>
+              <w:rPr>
+                <w:sz w:val="18"/>
+              </w:rPr>
+              <w:t>Users, structure, settings, windows, import</w:t>
+            </w:r>
+          </w:p>
+        </w:tc>
+        <w:tc>
+          <w:tcPr>
+            <w:tcW w:type="dxa" w:w="1377"/>
+          </w:tcPr>
+          <w:p>
+            <w:r/>
+            <w:r>
+              <w:rPr>
+                <w:sz w:val="18"/>
+              </w:rPr>
+              <w:t>✔</w:t>
+            </w:r>
+          </w:p>
+        </w:tc>
+        <w:tc>
+          <w:tcPr>
+            <w:tcW w:type="dxa" w:w="1377"/>
+          </w:tcPr>
+          <w:p>
+            <w:r/>
+          </w:p>
+        </w:tc>
+        <w:tc>
+          <w:tcPr>
+            <w:tcW w:type="dxa" w:w="1377"/>
+          </w:tcPr>
+          <w:p>
+            <w:r/>
+          </w:p>
+        </w:tc>
+        <w:tc>
+          <w:tcPr>
+            <w:tcW w:type="dxa" w:w="1377"/>
+          </w:tcPr>
+          <w:p>
+            <w:r/>
+          </w:p>
+        </w:tc>
+        <w:tc>
+          <w:tcPr>
+            <w:tcW w:type="dxa" w:w="1377"/>
+          </w:tcPr>
+          <w:p>
+            <w:r/>
+          </w:p>
+        </w:tc>
+        <w:tc>
+          <w:tcPr>
+            <w:tcW w:type="dxa" w:w="1377"/>
+          </w:tcPr>
+          <w:p>
+            <w:r/>
           </w:p>
         </w:tc>
       </w:tr>
@@ -8650,7 +8533,7 @@
         <w:t>The "New activity" button is missing or it says planning has ended.</w:t>
       </w:r>
       <w:r>
-        <w:t xml:space="preserve"> Your directorate has finalized its plan for that year, or the envelope has been received. Ask the head of your directorate to reopen it (before the envelope), or plan for the next year.</w:t>
+        <w:t xml:space="preserve"> Your directorate has finalized its plan for that year. Ask the head of your directorate to reopen it, or plan for the next year. (An approved activity can still be revised.)</w:t>
       </w:r>
     </w:p>
     <w:p>
@@ -8715,7 +8598,16 @@
         <w:t>An approved activity needs a change.</w:t>
       </w:r>
       <w:r>
-        <w:t xml:space="preserve"> The person who approves it reopens it with a reason, until the envelope is received. After that only the distribution changes.</w:t>
+        <w:t xml:space="preserve"> Start a revision: </w:t>
+      </w:r>
+      <w:r>
+        <w:rPr>
+          <w:i/>
+        </w:rPr>
+        <w:t>Revise</w:t>
+      </w:r>
+      <w:r>
+        <w:t xml:space="preserve"> on the activity, with a reason. It goes through the chain again and the approved version stays in force meanwhile.</w:t>
       </w:r>
     </w:p>
     <w:p>
@@ -9097,7 +8989,7 @@
                 <w:b/>
                 <w:sz w:val="18"/>
               </w:rPr>
-              <w:t>Fiscal envelope</w:t>
+              <w:t>Version</w:t>
             </w:r>
           </w:p>
         </w:tc>
@@ -9111,7 +9003,7 @@
               <w:rPr>
                 <w:sz w:val="18"/>
               </w:rPr>
-              <w:t>The amount received for the year.</w:t>
+              <w:t>A copy of an activity as it was approved; the latest approved version is in force.</w:t>
             </w:r>
           </w:p>
         </w:tc>
@@ -9129,7 +9021,7 @@
                 <w:b/>
                 <w:sz w:val="18"/>
               </w:rPr>
-              <w:t>Distribution</w:t>
+              <w:t>Revision</w:t>
             </w:r>
           </w:p>
         </w:tc>
@@ -9144,7 +9036,7 @@
               <w:rPr>
                 <w:sz w:val="18"/>
               </w:rPr>
-              <w:t>Sharing the envelope over the approved plan.</w:t>
+              <w:t>A change to an approved activity: a reason, the whole approval chain again, the version in force stays until it is approved.</w:t>
             </w:r>
           </w:p>
         </w:tc>
@@ -9208,7 +9100,7 @@
               <w:rPr>
                 <w:sz w:val="18"/>
               </w:rPr>
-              <w:t>One run of signatures; a return or reopening starts a new round.</w:t>
+              <w:t>One run of signatures; a return or the start of a revision starts a new round.</w:t>
             </w:r>
           </w:p>
         </w:tc>

</xml_diff>

<commit_message>
The role that prepares a unit's activities is "Technical Officer" (Técnico), not "Planner"; demo accounts tecnico.<code>@gdsc.tl; docs and deck follow
Co-Authored-By: Claude Sonnet 5.5 <noreply@anthropic.com>
</commit_message>
<xml_diff>
--- a/docs/MANUAL.docx
+++ b/docs/MANUAL.docx
@@ -861,7 +861,7 @@
               <w:rPr>
                 <w:sz w:val="18"/>
               </w:rPr>
-              <w:t>Planners, unit directors</w:t>
+              <w:t>Technical officers, unit directors</w:t>
             </w:r>
           </w:p>
         </w:tc>
@@ -1485,7 +1485,7 @@
         <w:t>Administration → Funding sources</w:t>
       </w:r>
       <w:r>
-        <w:t>: the list of where money comes from (State Budget, development partners and so on). Planners pick one for each budget line.</w:t>
+        <w:t>: the list of where money comes from (State Budget, development partners and so on). Technical officers pick one for each budget line.</w:t>
       </w:r>
     </w:p>
     <w:p>
@@ -1589,7 +1589,7 @@
         <w:t>each unit its own people</w:t>
       </w:r>
       <w:r>
-        <w:t>: a planner who prepares and a director who certifies. The unit decides what a person can see and plan.</w:t>
+        <w:t>: a technical officer who prepares and a director who certifies. The unit decides what a person can see and plan.</w:t>
       </w:r>
     </w:p>
     <w:tbl>
@@ -1766,7 +1766,7 @@
               <w:rPr>
                 <w:sz w:val="18"/>
               </w:rPr>
-              <w:t xml:space="preserve"> (planner)</w:t>
+              <w:t xml:space="preserve"> (technical officer)</w:t>
             </w:r>
           </w:p>
         </w:tc>
@@ -2102,7 +2102,7 @@
         <w:spacing w:after="120"/>
       </w:pPr>
       <w:r>
-        <w:t xml:space="preserve">For planners and unit directors. Open </w:t>
+        <w:t xml:space="preserve">For technical officers and unit directors. Open </w:t>
       </w:r>
       <w:r>
         <w:rPr>
@@ -3144,7 +3144,7 @@
               <w:rPr>
                 <w:sz w:val="18"/>
               </w:rPr>
-              <w:t xml:space="preserve">Planner or unit director → </w:t>
+              <w:t xml:space="preserve">Technical officer or unit director → </w:t>
             </w:r>
             <w:r>
               <w:rPr>
@@ -5958,7 +5958,7 @@
         <w:spacing w:after="120"/>
       </w:pPr>
       <w:r>
-        <w:t>Follow Ana (planner), Bento (director of a unit), Carla (head of a directorate), Dino (finance) and Eva (administrator).</w:t>
+        <w:t>Follow Ana (technical officer), Bento (director of a unit), Carla (head of a directorate), Dino (finance) and Eva (administrator).</w:t>
       </w:r>
     </w:p>
     <w:p>
@@ -6032,7 +6032,7 @@
         <w:t>System Users</w:t>
       </w:r>
       <w:r>
-        <w:t>: give every unit its planner and its director.</w:t>
+        <w:t>: give every unit its technical officer and its director.</w:t>
       </w:r>
     </w:p>
     <w:p>
@@ -6969,7 +6969,7 @@
                 <w:color w:val="FFFFFF"/>
                 <w:sz w:val="18"/>
               </w:rPr>
-              <w:t>Planner</w:t>
+              <w:t>Technical officer</w:t>
             </w:r>
           </w:p>
         </w:tc>

</xml_diff>

<commit_message>
Guard test: only the workflow service writes an approval-chain status; manual PDF and Word regenerated
NoDirectStatusUpdateTest scans app/ and resources/views for code that writes
an activity status itself (the old Review button did, with a variable). It
fails on the pre-fix paa-approval page and passes now. The Simulator is
allowed: it handles simulation records only. The manual's PDF and Word files
are regenerated from MANUAL.md (notifications now described as in-app and
synchronous). Closes the open item of PR-01.

Co-Authored-By: Claude Opus 5.5 <noreply@anthropic.com>
</commit_message>
<xml_diff>
--- a/docs/MANUAL.docx
+++ b/docs/MANUAL.docx
@@ -5937,7 +5937,7 @@
         <w:spacing w:after="120"/>
       </w:pPr>
       <w:r>
-        <w:t>Notifications are queued: the server must run the queue worker (Part 13.4) for them to arrive promptly.</w:t>
+        <w:t>Notifications are delivered inside the application as soon as the action happens; no queue worker or e-mail setup is needed for them.</w:t>
       </w:r>
     </w:p>
     <w:p>
@@ -6807,17 +6807,7 @@
         <w:t>Notifications</w:t>
       </w:r>
       <w:r>
-        <w:t xml:space="preserve"> are queued: run a queue worker (</w:t>
-      </w:r>
-      <w:r>
-        <w:rPr>
-          <w:rFonts w:ascii="Consolas" w:hAnsi="Consolas"/>
-          <w:sz w:val="19"/>
-        </w:rPr>
-        <w:t>php artisan queue:work</w:t>
-      </w:r>
-      <w:r>
-        <w:t>) in production.</w:t>
+        <w:t xml:space="preserve"> are written to the database at once and shown in the application; no queue worker is needed today (see the README, "Queue worker").</w:t>
       </w:r>
     </w:p>
     <w:p>

</xml_diff>

<commit_message>
Improvement documents and manual follow the optional rules
01-08 record the optional rules (off by default), the Simulator fix and the
backup copy, with their commits; the consolidation review decision stays not
built (no rule-holder known). The dev database has the four new migrations
(backup first, totals identical). Manual PDF and Word regenerated with Part 4.9.

Co-Authored-By: Claude Opus 5.5 <noreply@anthropic.com>
</commit_message>
<xml_diff>
--- a/docs/MANUAL.docx
+++ b/docs/MANUAL.docx
@@ -2008,6 +2008,23 @@
     </w:p>
     <w:p>
       <w:pPr>
+        <w:spacing w:after="120"/>
+      </w:pPr>
+      <w:r>
+        <w:t xml:space="preserve">A </w:t>
+      </w:r>
+      <w:r>
+        <w:rPr>
+          <w:b/>
+        </w:rPr>
+        <w:t>revisions</w:t>
+      </w:r>
+      <w:r>
+        <w:t xml:space="preserve"> window may also be set: it limits when approved activities can be revised. Without one, revisions can be made at any time; they are never held back by the plan-submission window.</w:t>
+      </w:r>
+    </w:p>
+    <w:p>
+      <w:pPr>
         <w:pStyle w:val="Heading2"/>
       </w:pPr>
       <w:r>
@@ -2082,6 +2099,389 @@
       </w:r>
       <w:r>
         <w:t xml:space="preserve"> removes only what the sample created; your real data is never touched.</w:t>
+      </w:r>
+    </w:p>
+    <w:p>
+      <w:pPr>
+        <w:pStyle w:val="Heading2"/>
+      </w:pPr>
+      <w:r>
+        <w:t>4.9 Optional rules</w:t>
+      </w:r>
+    </w:p>
+    <w:p>
+      <w:pPr>
+        <w:spacing w:after="120"/>
+      </w:pPr>
+      <w:r>
+        <w:rPr>
+          <w:b/>
+        </w:rPr>
+        <w:t>Administration → Optional rules</w:t>
+      </w:r>
+      <w:r>
+        <w:t xml:space="preserve"> holds rules that are </w:t>
+      </w:r>
+      <w:r>
+        <w:rPr>
+          <w:b/>
+        </w:rPr>
+        <w:t>off</w:t>
+      </w:r>
+      <w:r>
+        <w:t xml:space="preserve"> until your institution confirms that its own rules ask for them. Each changes only what is described here.</w:t>
+      </w:r>
+    </w:p>
+    <w:tbl>
+      <w:tblPr>
+        <w:tblStyle w:val="TableGrid"/>
+        <w:tblW w:type="auto" w:w="0"/>
+        <w:jc w:val="center"/>
+        <w:tblLook w:firstColumn="1" w:firstRow="1" w:lastColumn="0" w:lastRow="0" w:noHBand="0" w:noVBand="1" w:val="04A0"/>
+      </w:tblPr>
+      <w:tblGrid>
+        <w:gridCol w:w="4819"/>
+        <w:gridCol w:w="4819"/>
+      </w:tblGrid>
+      <w:tr>
+        <w:tc>
+          <w:tcPr>
+            <w:tcW w:type="dxa" w:w="4819"/>
+            <w:shd w:val="clear" w:color="auto" w:fill="1B2A41"/>
+          </w:tcPr>
+          <w:p>
+            <w:r/>
+            <w:r>
+              <w:rPr>
+                <w:b/>
+                <w:color w:val="FFFFFF"/>
+                <w:sz w:val="18"/>
+              </w:rPr>
+              <w:t>Rule</w:t>
+            </w:r>
+          </w:p>
+        </w:tc>
+        <w:tc>
+          <w:tcPr>
+            <w:tcW w:type="dxa" w:w="4819"/>
+            <w:shd w:val="clear" w:color="auto" w:fill="1B2A41"/>
+          </w:tcPr>
+          <w:p>
+            <w:r/>
+            <w:r>
+              <w:rPr>
+                <w:b/>
+                <w:color w:val="FFFFFF"/>
+                <w:sz w:val="18"/>
+              </w:rPr>
+              <w:t>When it is on</w:t>
+            </w:r>
+          </w:p>
+        </w:tc>
+      </w:tr>
+      <w:tr>
+        <w:tc>
+          <w:tcPr>
+            <w:tcW w:type="dxa" w:w="4819"/>
+          </w:tcPr>
+          <w:p>
+            <w:r/>
+            <w:r>
+              <w:rPr>
+                <w:b/>
+                <w:sz w:val="18"/>
+              </w:rPr>
+              <w:t>Every active directorate must submit</w:t>
+            </w:r>
+          </w:p>
+        </w:tc>
+        <w:tc>
+          <w:tcPr>
+            <w:tcW w:type="dxa" w:w="4819"/>
+          </w:tcPr>
+          <w:p>
+            <w:r/>
+            <w:r>
+              <w:rPr>
+                <w:sz w:val="18"/>
+              </w:rPr>
+              <w:t xml:space="preserve">Each active top-level unit of the year is expected to finalize a plan or to declare that it has </w:t>
+            </w:r>
+            <w:r>
+              <w:rPr>
+                <w:b/>
+                <w:sz w:val="18"/>
+              </w:rPr>
+              <w:t>nothing to plan</w:t>
+            </w:r>
+            <w:r>
+              <w:rPr>
+                <w:sz w:val="18"/>
+              </w:rPr>
+              <w:t xml:space="preserve"> (a nil return, with a reason). The year ends only when all of them have.</w:t>
+            </w:r>
+          </w:p>
+        </w:tc>
+      </w:tr>
+      <w:tr>
+        <w:tc>
+          <w:tcPr>
+            <w:tcW w:type="dxa" w:w="4819"/>
+            <w:shd w:val="clear" w:color="auto" w:fill="F5F8FB"/>
+          </w:tcPr>
+          <w:p>
+            <w:r/>
+            <w:r>
+              <w:rPr>
+                <w:b/>
+                <w:sz w:val="18"/>
+              </w:rPr>
+              <w:t>Also required before an activity is submitted</w:t>
+            </w:r>
+          </w:p>
+        </w:tc>
+        <w:tc>
+          <w:tcPr>
+            <w:tcW w:type="dxa" w:w="4819"/>
+            <w:shd w:val="clear" w:color="auto" w:fill="F5F8FB"/>
+          </w:tcPr>
+          <w:p>
+            <w:r/>
+            <w:r>
+              <w:rPr>
+                <w:sz w:val="18"/>
+              </w:rPr>
+              <w:t>The fields you tick (objective, person responsible, location, indicator baselines, means of verification) must be filled in before submitting.</w:t>
+            </w:r>
+          </w:p>
+        </w:tc>
+      </w:tr>
+      <w:tr>
+        <w:tc>
+          <w:tcPr>
+            <w:tcW w:type="dxa" w:w="4819"/>
+          </w:tcPr>
+          <w:p>
+            <w:r/>
+            <w:r>
+              <w:rPr>
+                <w:b/>
+                <w:sz w:val="18"/>
+              </w:rPr>
+              <w:t>Guidance for preparing the plan</w:t>
+            </w:r>
+          </w:p>
+        </w:tc>
+        <w:tc>
+          <w:tcPr>
+            <w:tcW w:type="dxa" w:w="4819"/>
+          </w:tcPr>
+          <w:p>
+            <w:r/>
+            <w:r>
+              <w:rPr>
+                <w:sz w:val="18"/>
+              </w:rPr>
+              <w:t>Free text per fiscal year, shown at the top of the activity form (for example the deadlines of the planning circular).</w:t>
+            </w:r>
+          </w:p>
+        </w:tc>
+      </w:tr>
+      <w:tr>
+        <w:tc>
+          <w:tcPr>
+            <w:tcW w:type="dxa" w:w="4819"/>
+            <w:shd w:val="clear" w:color="auto" w:fill="F5F8FB"/>
+          </w:tcPr>
+          <w:p>
+            <w:r/>
+            <w:r>
+              <w:rPr>
+                <w:b/>
+                <w:sz w:val="18"/>
+              </w:rPr>
+              <w:t>Some revisions need an approval outside the institution</w:t>
+            </w:r>
+          </w:p>
+        </w:tc>
+        <w:tc>
+          <w:tcPr>
+            <w:tcW w:type="dxa" w:w="4819"/>
+            <w:shd w:val="clear" w:color="auto" w:fill="F5F8FB"/>
+          </w:tcPr>
+          <w:p>
+            <w:r/>
+            <w:r>
+              <w:rPr>
+                <w:sz w:val="18"/>
+              </w:rPr>
+              <w:t>A revision can be marked as needing it; it is then approved only once the reference of that approval is recorded on the activity page.</w:t>
+            </w:r>
+          </w:p>
+        </w:tc>
+      </w:tr>
+      <w:tr>
+        <w:tc>
+          <w:tcPr>
+            <w:tcW w:type="dxa" w:w="4819"/>
+          </w:tcPr>
+          <w:p>
+            <w:r/>
+            <w:r>
+              <w:rPr>
+                <w:b/>
+                <w:sz w:val="18"/>
+              </w:rPr>
+              <w:t>Record the approved plan as a baseline</w:t>
+            </w:r>
+          </w:p>
+        </w:tc>
+        <w:tc>
+          <w:tcPr>
+            <w:tcW w:type="dxa" w:w="4819"/>
+          </w:tcPr>
+          <w:p>
+            <w:r/>
+            <w:r>
+              <w:rPr>
+                <w:sz w:val="18"/>
+              </w:rPr>
+              <w:t>An administrator records the approved plan of a year as it stands (</w:t>
+            </w:r>
+            <w:r>
+              <w:rPr>
+                <w:i/>
+                <w:sz w:val="18"/>
+              </w:rPr>
+              <w:t>Final plan report → Record baseline</w:t>
+            </w:r>
+            <w:r>
+              <w:rPr>
+                <w:sz w:val="18"/>
+              </w:rPr>
+              <w:t>); the report can then be printed as it stood at that moment. Recording a baseline approves nothing.</w:t>
+            </w:r>
+          </w:p>
+        </w:tc>
+      </w:tr>
+      <w:tr>
+        <w:tc>
+          <w:tcPr>
+            <w:tcW w:type="dxa" w:w="4819"/>
+            <w:shd w:val="clear" w:color="auto" w:fill="F5F8FB"/>
+          </w:tcPr>
+          <w:p>
+            <w:r/>
+            <w:r>
+              <w:rPr>
+                <w:b/>
+                <w:sz w:val="18"/>
+              </w:rPr>
+              <w:t>Finance officers work for the whole institution</w:t>
+            </w:r>
+          </w:p>
+        </w:tc>
+        <w:tc>
+          <w:tcPr>
+            <w:tcW w:type="dxa" w:w="4819"/>
+            <w:shd w:val="clear" w:color="auto" w:fill="F5F8FB"/>
+          </w:tcPr>
+          <w:p>
+            <w:r/>
+            <w:r>
+              <w:rPr>
+                <w:sz w:val="18"/>
+              </w:rPr>
+              <w:t>Finance officers see every unit, confirm budgets and verify spending everywhere.</w:t>
+            </w:r>
+          </w:p>
+        </w:tc>
+      </w:tr>
+      <w:tr>
+        <w:tc>
+          <w:tcPr>
+            <w:tcW w:type="dxa" w:w="4819"/>
+          </w:tcPr>
+          <w:p>
+            <w:r/>
+            <w:r>
+              <w:rPr>
+                <w:b/>
+                <w:sz w:val="18"/>
+              </w:rPr>
+              <w:t>Track corrective actions</w:t>
+            </w:r>
+          </w:p>
+        </w:tc>
+        <w:tc>
+          <w:tcPr>
+            <w:tcW w:type="dxa" w:w="4819"/>
+          </w:tcPr>
+          <w:p>
+            <w:r/>
+            <w:r>
+              <w:rPr>
+                <w:sz w:val="18"/>
+              </w:rPr>
+              <w:t xml:space="preserve">In </w:t>
+            </w:r>
+            <w:r>
+              <w:rPr>
+                <w:i/>
+                <w:sz w:val="18"/>
+              </w:rPr>
+              <w:t>Report execution → Narrative</w:t>
+            </w:r>
+            <w:r>
+              <w:rPr>
+                <w:sz w:val="18"/>
+              </w:rPr>
+              <w:t>, the unit records corrective actions with a person responsible and a due date, and closes them when done.</w:t>
+            </w:r>
+          </w:p>
+        </w:tc>
+      </w:tr>
+      <w:tr>
+        <w:tc>
+          <w:tcPr>
+            <w:tcW w:type="dxa" w:w="4819"/>
+            <w:shd w:val="clear" w:color="auto" w:fill="F5F8FB"/>
+          </w:tcPr>
+          <w:p>
+            <w:r/>
+            <w:r>
+              <w:rPr>
+                <w:b/>
+                <w:sz w:val="18"/>
+              </w:rPr>
+              <w:t>Reports keep the structure at approval</w:t>
+            </w:r>
+          </w:p>
+        </w:tc>
+        <w:tc>
+          <w:tcPr>
+            <w:tcW w:type="dxa" w:w="4819"/>
+            <w:shd w:val="clear" w:color="auto" w:fill="F5F8FB"/>
+          </w:tcPr>
+          <w:p>
+            <w:r/>
+            <w:r>
+              <w:rPr>
+                <w:sz w:val="18"/>
+              </w:rPr>
+              <w:t>The final report shows each activity under the unit it belonged to when it was approved, even after a restructuring.</w:t>
+            </w:r>
+          </w:p>
+        </w:tc>
+      </w:tr>
+    </w:tbl>
+    <w:p/>
+    <w:p>
+      <w:pPr>
+        <w:spacing w:after="120"/>
+      </w:pPr>
+      <w:r>
+        <w:t>Nothing in these rules decides who approves the consolidated plan of the institution: no such step is assumed.</w:t>
       </w:r>
     </w:p>
     <w:p>

</xml_diff>

<commit_message>
Docker Compose production stack (nginx, PHP-FPM, queue, scheduler, MySQL, Redis, optional Caddy), e-mail notifications (queued, opt-out), live bell; docs and deck v7
Co-Authored-By: Claude Sonnet 5.5 <noreply@anthropic.com>
</commit_message>
<xml_diff>
--- a/docs/MANUAL.docx
+++ b/docs/MANUAL.docx
@@ -7347,7 +7347,48 @@
         <w:spacing w:after="120"/>
       </w:pPr>
       <w:r>
-        <w:t>Notifications are delivered inside the application as soon as the action happens; no queue worker or e-mail setup is needed for them.</w:t>
+        <w:t xml:space="preserve">Notifications are delivered inside the application as soon as the action happens, and appear in the </w:t>
+      </w:r>
+      <w:r>
+        <w:rPr>
+          <w:b/>
+        </w:rPr>
+        <w:t>bell</w:t>
+      </w:r>
+      <w:r>
+        <w:t xml:space="preserve"> at the top. While a page is open the bell checks for new ones every 20 seconds and shows a short message when one arrives; you do not have to reload.</w:t>
+      </w:r>
+    </w:p>
+    <w:p>
+      <w:pPr>
+        <w:spacing w:after="120"/>
+      </w:pPr>
+      <w:r>
+        <w:rPr>
+          <w:b/>
+        </w:rPr>
+        <w:t>E-mail.</w:t>
+      </w:r>
+      <w:r>
+        <w:t xml:space="preserve"> An administrator can switch on </w:t>
+      </w:r>
+      <w:r>
+        <w:rPr>
+          <w:b/>
+        </w:rPr>
+        <w:t>System → Settings → Send notifications by e-mail</w:t>
+      </w:r>
+      <w:r>
+        <w:t xml:space="preserve">. Every notification is then also e-mailed to the people who have not opted out; each person chooses in </w:t>
+      </w:r>
+      <w:r>
+        <w:rPr>
+          <w:b/>
+        </w:rPr>
+        <w:t>Profile → Also send me notifications by e-mail</w:t>
+      </w:r>
+      <w:r>
+        <w:t>. The mail is sent in the background, so a slow mail server never holds up what you are doing. It needs the server's mail settings and a running queue worker (the Docker stack includes one). The bell is never optional.</w:t>
       </w:r>
     </w:p>
     <w:p>

</xml_diff>